<commit_message>
Master KPI doc: add formula+input-key working blocks before analysis
</commit_message>
<xml_diff>
--- a/APC-2026-Diamante-Industry-KPIs-Master.docx
+++ b/APC-2026-Diamante-Industry-KPIs-Master.docx
@@ -22,7 +22,7 @@
           <w:i/>
           <w:sz w:val="18"/>
         </w:rPr>
-        <w:t>This is the master performance-measurement note for Diamante. It sets out the KPIs expected of a diamond miner, applies them to Diamante using the pre-release financials, and analyses the standard industry KPIs that Diamante is missing. The detailed Document 5 KPI critique and the Petra/Gem financial comparison are in the companion documents and are not repeated here. Amounts are in R millions unless stated.</w:t>
+        <w:t>This is the master performance-measurement note for Diamante. It sets out the KPIs expected of a diamond miner, applies them to Diamante using the pre-release financials (with the formula and the inputs shown before each is analysed), and analyses the standard industry KPIs that Diamante is missing. The detailed Document 5 critique and the Petra/Gem comparison are in the companion documents and are not repeated here. Amounts are in R millions unless stated.</w:t>
       </w:r>
     </w:p>
     <w:p>
@@ -145,7 +145,7 @@
               <w:rPr>
                 <w:sz w:val="17"/>
               </w:rPr>
-              <w:t>Carats recovered; tonnes treated; grade (carats per hundred tonnes); recovery/yield; waste stripping / development metres</w:t>
+              <w:t>Carats recovered; tonnes treated; grade (carats per hundred tonnes); recovery/yield; waste stripping</w:t>
             </w:r>
           </w:p>
         </w:tc>
@@ -175,7 +175,7 @@
               <w:rPr>
                 <w:sz w:val="17"/>
               </w:rPr>
-              <w:t>How much value is realised per unit</w:t>
+              <w:t>Value realised per unit</w:t>
             </w:r>
           </w:p>
         </w:tc>
@@ -233,7 +233,7 @@
               <w:rPr>
                 <w:sz w:val="17"/>
               </w:rPr>
-              <w:t>On-mine cost per carat and per tonne treated; unit-cost trend</w:t>
+              <w:t>On-mine cost per carat and per tonne; unit-cost trend</w:t>
             </w:r>
           </w:p>
         </w:tc>
@@ -277,7 +277,7 @@
               <w:rPr>
                 <w:sz w:val="17"/>
               </w:rPr>
-              <w:t>Operating margin; EBITDA and EBITDA margin; net margin; return on capital employed</w:t>
+              <w:t>Operating margin; EBITDA and EBITDA margin; net margin; return on assets</w:t>
             </w:r>
           </w:p>
         </w:tc>
@@ -351,7 +351,7 @@
               <w:rPr>
                 <w:sz w:val="17"/>
               </w:rPr>
-              <w:t>Efficiency of receivables, inventory, payables</w:t>
+              <w:t>Efficiency of working capital</w:t>
             </w:r>
           </w:p>
         </w:tc>
@@ -365,7 +365,7 @@
               <w:rPr>
                 <w:sz w:val="17"/>
               </w:rPr>
-              <w:t>Inventory, receivables and payables days; cash conversion cycle</w:t>
+              <w:t>Inventory, receivables and payables days</w:t>
             </w:r>
           </w:p>
         </w:tc>
@@ -453,7 +453,7 @@
               <w:rPr>
                 <w:sz w:val="17"/>
               </w:rPr>
-              <w:t>Scope 1 and 2 emissions vs roadmap; water use; tailings compliance; rehabilitation</w:t>
+              <w:t>Scope 1 and 2 emissions vs roadmap; water; tailings; rehabilitation</w:t>
             </w:r>
           </w:p>
         </w:tc>
@@ -560,12 +560,882 @@
           <w:color w:val="1F3D6B"/>
           <w:sz w:val="26"/>
         </w:rPr>
-        <w:t>2. The KPIs applied to Diamante (calculated from the pre-release)</w:t>
+        <w:t>2. The KPIs applied to Diamante (formula, inputs, then analysis)</w:t>
       </w:r>
     </w:p>
     <w:p>
       <w:pPr>
-        <w:spacing w:before="100" w:after="20"/>
+        <w:spacing w:before="40" w:after="20"/>
+      </w:pPr>
+      <w:r>
+        <w:rPr>
+          <w:b/>
+          <w:i/>
+          <w:color w:val="555555"/>
+          <w:sz w:val="18"/>
+        </w:rPr>
+        <w:t>Key inputs used (from the draft FY2026 pre-release, R millions)</w:t>
+      </w:r>
+    </w:p>
+    <w:tbl>
+      <w:tblPr>
+        <w:tblStyle w:val="TableGrid"/>
+        <w:tblW w:type="auto" w:w="0"/>
+        <w:jc w:val="center"/>
+        <w:tblLook w:firstColumn="1" w:firstRow="1" w:lastColumn="0" w:lastRow="0" w:noHBand="0" w:noVBand="1" w:val="04A0"/>
+      </w:tblPr>
+      <w:tblGrid>
+        <w:gridCol w:w="1776"/>
+        <w:gridCol w:w="1776"/>
+        <w:gridCol w:w="1776"/>
+        <w:gridCol w:w="1776"/>
+        <w:gridCol w:w="1776"/>
+        <w:gridCol w:w="1776"/>
+      </w:tblGrid>
+      <w:tr>
+        <w:tc>
+          <w:tcPr>
+            <w:tcW w:type="dxa" w:w="2448"/>
+            <w:shd w:val="clear" w:fill="4a5a72"/>
+          </w:tcPr>
+          <w:p>
+            <w:r/>
+            <w:r>
+              <w:rPr>
+                <w:b/>
+                <w:color w:val="FFFFFF"/>
+                <w:sz w:val="17"/>
+              </w:rPr>
+              <w:t>Input</w:t>
+            </w:r>
+          </w:p>
+        </w:tc>
+        <w:tc>
+          <w:tcPr>
+            <w:tcW w:type="dxa" w:w="864"/>
+            <w:shd w:val="clear" w:fill="4a5a72"/>
+          </w:tcPr>
+          <w:p>
+            <w:r/>
+            <w:r>
+              <w:rPr>
+                <w:b/>
+                <w:color w:val="FFFFFF"/>
+                <w:sz w:val="17"/>
+              </w:rPr>
+              <w:t>2026</w:t>
+            </w:r>
+          </w:p>
+        </w:tc>
+        <w:tc>
+          <w:tcPr>
+            <w:tcW w:type="dxa" w:w="864"/>
+            <w:shd w:val="clear" w:fill="4a5a72"/>
+          </w:tcPr>
+          <w:p>
+            <w:r/>
+            <w:r>
+              <w:rPr>
+                <w:b/>
+                <w:color w:val="FFFFFF"/>
+                <w:sz w:val="17"/>
+              </w:rPr>
+              <w:t>2025</w:t>
+            </w:r>
+          </w:p>
+        </w:tc>
+        <w:tc>
+          <w:tcPr>
+            <w:tcW w:type="dxa" w:w="2448"/>
+            <w:shd w:val="clear" w:fill="4a5a72"/>
+          </w:tcPr>
+          <w:p>
+            <w:r/>
+            <w:r>
+              <w:rPr>
+                <w:b/>
+                <w:color w:val="FFFFFF"/>
+                <w:sz w:val="17"/>
+              </w:rPr>
+              <w:t>Input</w:t>
+            </w:r>
+          </w:p>
+        </w:tc>
+        <w:tc>
+          <w:tcPr>
+            <w:tcW w:type="dxa" w:w="864"/>
+            <w:shd w:val="clear" w:fill="4a5a72"/>
+          </w:tcPr>
+          <w:p>
+            <w:r/>
+            <w:r>
+              <w:rPr>
+                <w:b/>
+                <w:color w:val="FFFFFF"/>
+                <w:sz w:val="17"/>
+              </w:rPr>
+              <w:t>2026</w:t>
+            </w:r>
+          </w:p>
+        </w:tc>
+        <w:tc>
+          <w:tcPr>
+            <w:tcW w:type="dxa" w:w="864"/>
+            <w:shd w:val="clear" w:fill="4a5a72"/>
+          </w:tcPr>
+          <w:p>
+            <w:r/>
+            <w:r>
+              <w:rPr>
+                <w:b/>
+                <w:color w:val="FFFFFF"/>
+                <w:sz w:val="17"/>
+              </w:rPr>
+              <w:t>2025</w:t>
+            </w:r>
+          </w:p>
+        </w:tc>
+      </w:tr>
+      <w:tr>
+        <w:tc>
+          <w:tcPr>
+            <w:tcW w:type="dxa" w:w="2448"/>
+            <w:shd w:val="clear" w:fill="f4f6fa"/>
+          </w:tcPr>
+          <w:p>
+            <w:r/>
+            <w:r>
+              <w:rPr>
+                <w:sz w:val="17"/>
+              </w:rPr>
+              <w:t>Revenue</w:t>
+            </w:r>
+          </w:p>
+        </w:tc>
+        <w:tc>
+          <w:tcPr>
+            <w:tcW w:type="dxa" w:w="864"/>
+            <w:shd w:val="clear" w:fill="f4f6fa"/>
+          </w:tcPr>
+          <w:p>
+            <w:r/>
+            <w:r>
+              <w:rPr>
+                <w:sz w:val="17"/>
+              </w:rPr>
+              <w:t>1 863</w:t>
+            </w:r>
+          </w:p>
+        </w:tc>
+        <w:tc>
+          <w:tcPr>
+            <w:tcW w:type="dxa" w:w="864"/>
+            <w:shd w:val="clear" w:fill="f4f6fa"/>
+          </w:tcPr>
+          <w:p>
+            <w:r/>
+            <w:r>
+              <w:rPr>
+                <w:sz w:val="17"/>
+              </w:rPr>
+              <w:t>2 790</w:t>
+            </w:r>
+          </w:p>
+        </w:tc>
+        <w:tc>
+          <w:tcPr>
+            <w:tcW w:type="dxa" w:w="2448"/>
+            <w:shd w:val="clear" w:fill="f4f6fa"/>
+          </w:tcPr>
+          <w:p>
+            <w:r/>
+            <w:r>
+              <w:rPr>
+                <w:sz w:val="17"/>
+              </w:rPr>
+              <w:t>Total assets</w:t>
+            </w:r>
+          </w:p>
+        </w:tc>
+        <w:tc>
+          <w:tcPr>
+            <w:tcW w:type="dxa" w:w="864"/>
+            <w:shd w:val="clear" w:fill="f4f6fa"/>
+          </w:tcPr>
+          <w:p>
+            <w:r/>
+            <w:r>
+              <w:rPr>
+                <w:sz w:val="17"/>
+              </w:rPr>
+              <w:t>4 851</w:t>
+            </w:r>
+          </w:p>
+        </w:tc>
+        <w:tc>
+          <w:tcPr>
+            <w:tcW w:type="dxa" w:w="864"/>
+            <w:shd w:val="clear" w:fill="f4f6fa"/>
+          </w:tcPr>
+          <w:p>
+            <w:r/>
+            <w:r>
+              <w:rPr>
+                <w:sz w:val="17"/>
+              </w:rPr>
+              <w:t>6 804</w:t>
+            </w:r>
+          </w:p>
+        </w:tc>
+      </w:tr>
+      <w:tr>
+        <w:tc>
+          <w:tcPr>
+            <w:tcW w:type="dxa" w:w="2448"/>
+            <w:shd w:val="clear" w:fill="f4f6fa"/>
+          </w:tcPr>
+          <w:p>
+            <w:r/>
+            <w:r>
+              <w:rPr>
+                <w:sz w:val="17"/>
+              </w:rPr>
+              <w:t>Mining costs</w:t>
+            </w:r>
+          </w:p>
+        </w:tc>
+        <w:tc>
+          <w:tcPr>
+            <w:tcW w:type="dxa" w:w="864"/>
+            <w:shd w:val="clear" w:fill="f4f6fa"/>
+          </w:tcPr>
+          <w:p>
+            <w:r/>
+            <w:r>
+              <w:rPr>
+                <w:sz w:val="17"/>
+              </w:rPr>
+              <w:t>2 295</w:t>
+            </w:r>
+          </w:p>
+        </w:tc>
+        <w:tc>
+          <w:tcPr>
+            <w:tcW w:type="dxa" w:w="864"/>
+            <w:shd w:val="clear" w:fill="f4f6fa"/>
+          </w:tcPr>
+          <w:p>
+            <w:r/>
+            <w:r>
+              <w:rPr>
+                <w:sz w:val="17"/>
+              </w:rPr>
+              <w:t>2 817</w:t>
+            </w:r>
+          </w:p>
+        </w:tc>
+        <w:tc>
+          <w:tcPr>
+            <w:tcW w:type="dxa" w:w="2448"/>
+            <w:shd w:val="clear" w:fill="f4f6fa"/>
+          </w:tcPr>
+          <w:p>
+            <w:r/>
+            <w:r>
+              <w:rPr>
+                <w:sz w:val="17"/>
+              </w:rPr>
+              <w:t>Equity</w:t>
+            </w:r>
+          </w:p>
+        </w:tc>
+        <w:tc>
+          <w:tcPr>
+            <w:tcW w:type="dxa" w:w="864"/>
+            <w:shd w:val="clear" w:fill="f4f6fa"/>
+          </w:tcPr>
+          <w:p>
+            <w:r/>
+            <w:r>
+              <w:rPr>
+                <w:sz w:val="17"/>
+              </w:rPr>
+              <w:t>891</w:t>
+            </w:r>
+          </w:p>
+        </w:tc>
+        <w:tc>
+          <w:tcPr>
+            <w:tcW w:type="dxa" w:w="864"/>
+            <w:shd w:val="clear" w:fill="f4f6fa"/>
+          </w:tcPr>
+          <w:p>
+            <w:r/>
+            <w:r>
+              <w:rPr>
+                <w:sz w:val="17"/>
+              </w:rPr>
+              <w:t>1 917</w:t>
+            </w:r>
+          </w:p>
+        </w:tc>
+      </w:tr>
+      <w:tr>
+        <w:tc>
+          <w:tcPr>
+            <w:tcW w:type="dxa" w:w="2448"/>
+            <w:shd w:val="clear" w:fill="f4f6fa"/>
+          </w:tcPr>
+          <w:p>
+            <w:r/>
+            <w:r>
+              <w:rPr>
+                <w:sz w:val="17"/>
+              </w:rPr>
+              <w:t>Operating loss</w:t>
+            </w:r>
+          </w:p>
+        </w:tc>
+        <w:tc>
+          <w:tcPr>
+            <w:tcW w:type="dxa" w:w="864"/>
+            <w:shd w:val="clear" w:fill="f4f6fa"/>
+          </w:tcPr>
+          <w:p>
+            <w:r/>
+            <w:r>
+              <w:rPr>
+                <w:sz w:val="17"/>
+              </w:rPr>
+              <w:t>(1 638)</w:t>
+            </w:r>
+          </w:p>
+        </w:tc>
+        <w:tc>
+          <w:tcPr>
+            <w:tcW w:type="dxa" w:w="864"/>
+            <w:shd w:val="clear" w:fill="f4f6fa"/>
+          </w:tcPr>
+          <w:p>
+            <w:r/>
+            <w:r>
+              <w:rPr>
+                <w:sz w:val="17"/>
+              </w:rPr>
+              <w:t>(864)</w:t>
+            </w:r>
+          </w:p>
+        </w:tc>
+        <w:tc>
+          <w:tcPr>
+            <w:tcW w:type="dxa" w:w="2448"/>
+            <w:shd w:val="clear" w:fill="f4f6fa"/>
+          </w:tcPr>
+          <w:p>
+            <w:r/>
+            <w:r>
+              <w:rPr>
+                <w:sz w:val="17"/>
+              </w:rPr>
+              <w:t>Borrowings (total)</w:t>
+            </w:r>
+          </w:p>
+        </w:tc>
+        <w:tc>
+          <w:tcPr>
+            <w:tcW w:type="dxa" w:w="864"/>
+            <w:shd w:val="clear" w:fill="f4f6fa"/>
+          </w:tcPr>
+          <w:p>
+            <w:r/>
+            <w:r>
+              <w:rPr>
+                <w:sz w:val="17"/>
+              </w:rPr>
+              <w:t>2 925</w:t>
+            </w:r>
+          </w:p>
+        </w:tc>
+        <w:tc>
+          <w:tcPr>
+            <w:tcW w:type="dxa" w:w="864"/>
+            <w:shd w:val="clear" w:fill="f4f6fa"/>
+          </w:tcPr>
+          <w:p>
+            <w:r/>
+            <w:r>
+              <w:rPr>
+                <w:sz w:val="17"/>
+              </w:rPr>
+              <w:t>2 439</w:t>
+            </w:r>
+          </w:p>
+        </w:tc>
+      </w:tr>
+      <w:tr>
+        <w:tc>
+          <w:tcPr>
+            <w:tcW w:type="dxa" w:w="2448"/>
+            <w:shd w:val="clear" w:fill="f4f6fa"/>
+          </w:tcPr>
+          <w:p>
+            <w:r/>
+            <w:r>
+              <w:rPr>
+                <w:sz w:val="17"/>
+              </w:rPr>
+              <w:t>Impairments (total)</w:t>
+            </w:r>
+          </w:p>
+        </w:tc>
+        <w:tc>
+          <w:tcPr>
+            <w:tcW w:type="dxa" w:w="864"/>
+            <w:shd w:val="clear" w:fill="f4f6fa"/>
+          </w:tcPr>
+          <w:p>
+            <w:r/>
+            <w:r>
+              <w:rPr>
+                <w:sz w:val="17"/>
+              </w:rPr>
+              <w:t>1 170</w:t>
+            </w:r>
+          </w:p>
+        </w:tc>
+        <w:tc>
+          <w:tcPr>
+            <w:tcW w:type="dxa" w:w="864"/>
+            <w:shd w:val="clear" w:fill="f4f6fa"/>
+          </w:tcPr>
+          <w:p>
+            <w:r/>
+            <w:r>
+              <w:rPr>
+                <w:sz w:val="17"/>
+              </w:rPr>
+              <w:t>729</w:t>
+            </w:r>
+          </w:p>
+        </w:tc>
+        <w:tc>
+          <w:tcPr>
+            <w:tcW w:type="dxa" w:w="2448"/>
+            <w:shd w:val="clear" w:fill="f4f6fa"/>
+          </w:tcPr>
+          <w:p>
+            <w:r/>
+            <w:r>
+              <w:rPr>
+                <w:sz w:val="17"/>
+              </w:rPr>
+              <w:t>Cash</w:t>
+            </w:r>
+          </w:p>
+        </w:tc>
+        <w:tc>
+          <w:tcPr>
+            <w:tcW w:type="dxa" w:w="864"/>
+            <w:shd w:val="clear" w:fill="f4f6fa"/>
+          </w:tcPr>
+          <w:p>
+            <w:r/>
+            <w:r>
+              <w:rPr>
+                <w:sz w:val="17"/>
+              </w:rPr>
+              <w:t>333</w:t>
+            </w:r>
+          </w:p>
+        </w:tc>
+        <w:tc>
+          <w:tcPr>
+            <w:tcW w:type="dxa" w:w="864"/>
+            <w:shd w:val="clear" w:fill="f4f6fa"/>
+          </w:tcPr>
+          <w:p>
+            <w:r/>
+            <w:r>
+              <w:rPr>
+                <w:sz w:val="17"/>
+              </w:rPr>
+              <w:t>261</w:t>
+            </w:r>
+          </w:p>
+        </w:tc>
+      </w:tr>
+      <w:tr>
+        <w:tc>
+          <w:tcPr>
+            <w:tcW w:type="dxa" w:w="2448"/>
+            <w:shd w:val="clear" w:fill="f4f6fa"/>
+          </w:tcPr>
+          <w:p>
+            <w:r/>
+            <w:r>
+              <w:rPr>
+                <w:sz w:val="17"/>
+              </w:rPr>
+              <w:t>Depreciation (mining)</w:t>
+            </w:r>
+          </w:p>
+        </w:tc>
+        <w:tc>
+          <w:tcPr>
+            <w:tcW w:type="dxa" w:w="864"/>
+            <w:shd w:val="clear" w:fill="f4f6fa"/>
+          </w:tcPr>
+          <w:p>
+            <w:r/>
+            <w:r>
+              <w:rPr>
+                <w:sz w:val="17"/>
+              </w:rPr>
+              <w:t>675</w:t>
+            </w:r>
+          </w:p>
+        </w:tc>
+        <w:tc>
+          <w:tcPr>
+            <w:tcW w:type="dxa" w:w="864"/>
+            <w:shd w:val="clear" w:fill="f4f6fa"/>
+          </w:tcPr>
+          <w:p>
+            <w:r/>
+            <w:r>
+              <w:rPr>
+                <w:sz w:val="17"/>
+              </w:rPr>
+              <w:t>675</w:t>
+            </w:r>
+          </w:p>
+        </w:tc>
+        <w:tc>
+          <w:tcPr>
+            <w:tcW w:type="dxa" w:w="2448"/>
+            <w:shd w:val="clear" w:fill="f4f6fa"/>
+          </w:tcPr>
+          <w:p>
+            <w:r/>
+            <w:r>
+              <w:rPr>
+                <w:sz w:val="17"/>
+              </w:rPr>
+              <w:t>Current assets</w:t>
+            </w:r>
+          </w:p>
+        </w:tc>
+        <w:tc>
+          <w:tcPr>
+            <w:tcW w:type="dxa" w:w="864"/>
+            <w:shd w:val="clear" w:fill="f4f6fa"/>
+          </w:tcPr>
+          <w:p>
+            <w:r/>
+            <w:r>
+              <w:rPr>
+                <w:sz w:val="17"/>
+              </w:rPr>
+              <w:t>1 017</w:t>
+            </w:r>
+          </w:p>
+        </w:tc>
+        <w:tc>
+          <w:tcPr>
+            <w:tcW w:type="dxa" w:w="864"/>
+            <w:shd w:val="clear" w:fill="f4f6fa"/>
+          </w:tcPr>
+          <w:p>
+            <w:r/>
+            <w:r>
+              <w:rPr>
+                <w:sz w:val="17"/>
+              </w:rPr>
+              <w:t>1 350</w:t>
+            </w:r>
+          </w:p>
+        </w:tc>
+      </w:tr>
+      <w:tr>
+        <w:tc>
+          <w:tcPr>
+            <w:tcW w:type="dxa" w:w="2448"/>
+            <w:shd w:val="clear" w:fill="f4f6fa"/>
+          </w:tcPr>
+          <w:p>
+            <w:r/>
+            <w:r>
+              <w:rPr>
+                <w:sz w:val="17"/>
+              </w:rPr>
+              <w:t>Loss for the year</w:t>
+            </w:r>
+          </w:p>
+        </w:tc>
+        <w:tc>
+          <w:tcPr>
+            <w:tcW w:type="dxa" w:w="864"/>
+            <w:shd w:val="clear" w:fill="f4f6fa"/>
+          </w:tcPr>
+          <w:p>
+            <w:r/>
+            <w:r>
+              <w:rPr>
+                <w:sz w:val="17"/>
+              </w:rPr>
+              <w:t>(1 044)</w:t>
+            </w:r>
+          </w:p>
+        </w:tc>
+        <w:tc>
+          <w:tcPr>
+            <w:tcW w:type="dxa" w:w="864"/>
+            <w:shd w:val="clear" w:fill="f4f6fa"/>
+          </w:tcPr>
+          <w:p>
+            <w:r/>
+            <w:r>
+              <w:rPr>
+                <w:sz w:val="17"/>
+              </w:rPr>
+              <w:t>(963)</w:t>
+            </w:r>
+          </w:p>
+        </w:tc>
+        <w:tc>
+          <w:tcPr>
+            <w:tcW w:type="dxa" w:w="2448"/>
+            <w:shd w:val="clear" w:fill="f4f6fa"/>
+          </w:tcPr>
+          <w:p>
+            <w:r/>
+            <w:r>
+              <w:rPr>
+                <w:sz w:val="17"/>
+              </w:rPr>
+              <w:t>Current liabilities</w:t>
+            </w:r>
+          </w:p>
+        </w:tc>
+        <w:tc>
+          <w:tcPr>
+            <w:tcW w:type="dxa" w:w="864"/>
+            <w:shd w:val="clear" w:fill="f4f6fa"/>
+          </w:tcPr>
+          <w:p>
+            <w:r/>
+            <w:r>
+              <w:rPr>
+                <w:sz w:val="17"/>
+              </w:rPr>
+              <w:t>3 357</w:t>
+            </w:r>
+          </w:p>
+        </w:tc>
+        <w:tc>
+          <w:tcPr>
+            <w:tcW w:type="dxa" w:w="864"/>
+            <w:shd w:val="clear" w:fill="f4f6fa"/>
+          </w:tcPr>
+          <w:p>
+            <w:r/>
+            <w:r>
+              <w:rPr>
+                <w:sz w:val="17"/>
+              </w:rPr>
+              <w:t>1 206</w:t>
+            </w:r>
+          </w:p>
+        </w:tc>
+      </w:tr>
+      <w:tr>
+        <w:tc>
+          <w:tcPr>
+            <w:tcW w:type="dxa" w:w="2448"/>
+            <w:shd w:val="clear" w:fill="f4f6fa"/>
+          </w:tcPr>
+          <w:p>
+            <w:r/>
+            <w:r>
+              <w:rPr>
+                <w:sz w:val="17"/>
+              </w:rPr>
+              <w:t>Inventory</w:t>
+            </w:r>
+          </w:p>
+        </w:tc>
+        <w:tc>
+          <w:tcPr>
+            <w:tcW w:type="dxa" w:w="864"/>
+            <w:shd w:val="clear" w:fill="f4f6fa"/>
+          </w:tcPr>
+          <w:p>
+            <w:r/>
+            <w:r>
+              <w:rPr>
+                <w:sz w:val="17"/>
+              </w:rPr>
+              <w:t>315</w:t>
+            </w:r>
+          </w:p>
+        </w:tc>
+        <w:tc>
+          <w:tcPr>
+            <w:tcW w:type="dxa" w:w="864"/>
+            <w:shd w:val="clear" w:fill="f4f6fa"/>
+          </w:tcPr>
+          <w:p>
+            <w:r/>
+            <w:r>
+              <w:rPr>
+                <w:sz w:val="17"/>
+              </w:rPr>
+              <w:t>459</w:t>
+            </w:r>
+          </w:p>
+        </w:tc>
+        <w:tc>
+          <w:tcPr>
+            <w:tcW w:type="dxa" w:w="2448"/>
+            <w:shd w:val="clear" w:fill="f4f6fa"/>
+          </w:tcPr>
+          <w:p>
+            <w:r/>
+            <w:r>
+              <w:rPr>
+                <w:sz w:val="17"/>
+              </w:rPr>
+              <w:t>Trade receivables</w:t>
+            </w:r>
+          </w:p>
+        </w:tc>
+        <w:tc>
+          <w:tcPr>
+            <w:tcW w:type="dxa" w:w="864"/>
+            <w:shd w:val="clear" w:fill="f4f6fa"/>
+          </w:tcPr>
+          <w:p>
+            <w:r/>
+            <w:r>
+              <w:rPr>
+                <w:sz w:val="17"/>
+              </w:rPr>
+              <w:t>198</w:t>
+            </w:r>
+          </w:p>
+        </w:tc>
+        <w:tc>
+          <w:tcPr>
+            <w:tcW w:type="dxa" w:w="864"/>
+            <w:shd w:val="clear" w:fill="f4f6fa"/>
+          </w:tcPr>
+          <w:p>
+            <w:r/>
+            <w:r>
+              <w:rPr>
+                <w:sz w:val="17"/>
+              </w:rPr>
+              <w:t>477</w:t>
+            </w:r>
+          </w:p>
+        </w:tc>
+      </w:tr>
+      <w:tr>
+        <w:tc>
+          <w:tcPr>
+            <w:tcW w:type="dxa" w:w="2448"/>
+            <w:shd w:val="clear" w:fill="f4f6fa"/>
+          </w:tcPr>
+          <w:p>
+            <w:r/>
+            <w:r>
+              <w:rPr>
+                <w:sz w:val="17"/>
+              </w:rPr>
+              <w:t>Trade payables</w:t>
+            </w:r>
+          </w:p>
+        </w:tc>
+        <w:tc>
+          <w:tcPr>
+            <w:tcW w:type="dxa" w:w="864"/>
+            <w:shd w:val="clear" w:fill="f4f6fa"/>
+          </w:tcPr>
+          <w:p>
+            <w:r/>
+            <w:r>
+              <w:rPr>
+                <w:sz w:val="17"/>
+              </w:rPr>
+              <w:t>297</w:t>
+            </w:r>
+          </w:p>
+        </w:tc>
+        <w:tc>
+          <w:tcPr>
+            <w:tcW w:type="dxa" w:w="864"/>
+            <w:shd w:val="clear" w:fill="f4f6fa"/>
+          </w:tcPr>
+          <w:p>
+            <w:r/>
+            <w:r>
+              <w:rPr>
+                <w:sz w:val="17"/>
+              </w:rPr>
+              <w:t>702</w:t>
+            </w:r>
+          </w:p>
+        </w:tc>
+        <w:tc>
+          <w:tcPr>
+            <w:tcW w:type="dxa" w:w="2448"/>
+            <w:shd w:val="clear" w:fill="f4f6fa"/>
+          </w:tcPr>
+          <w:p>
+            <w:r/>
+            <w:r>
+              <w:rPr>
+                <w:sz w:val="17"/>
+              </w:rPr>
+              <w:t>Finance expense</w:t>
+            </w:r>
+          </w:p>
+        </w:tc>
+        <w:tc>
+          <w:tcPr>
+            <w:tcW w:type="dxa" w:w="864"/>
+            <w:shd w:val="clear" w:fill="f4f6fa"/>
+          </w:tcPr>
+          <w:p>
+            <w:r/>
+            <w:r>
+              <w:rPr>
+                <w:sz w:val="17"/>
+              </w:rPr>
+              <w:t>378</w:t>
+            </w:r>
+          </w:p>
+        </w:tc>
+        <w:tc>
+          <w:tcPr>
+            <w:tcW w:type="dxa" w:w="864"/>
+            <w:shd w:val="clear" w:fill="f4f6fa"/>
+          </w:tcPr>
+          <w:p>
+            <w:r/>
+            <w:r>
+              <w:rPr>
+                <w:sz w:val="17"/>
+              </w:rPr>
+              <w:t>360</w:t>
+            </w:r>
+          </w:p>
+        </w:tc>
+      </w:tr>
+    </w:tbl>
+    <w:p>
+      <w:pPr>
+        <w:spacing w:before="120" w:after="20"/>
       </w:pPr>
       <w:r>
         <w:rPr>
@@ -573,7 +1443,21 @@
           <w:color w:val="1F3D6B"/>
           <w:sz w:val="22"/>
         </w:rPr>
-        <w:t>2.1 Production and operating</w:t>
+        <w:t>2.1 Profitability</w:t>
+      </w:r>
+    </w:p>
+    <w:p>
+      <w:pPr>
+        <w:spacing w:before="40" w:after="20"/>
+      </w:pPr>
+      <w:r>
+        <w:rPr>
+          <w:b/>
+          <w:i/>
+          <w:color w:val="555555"/>
+          <w:sz w:val="18"/>
+        </w:rPr>
+        <w:t>Formula and inputs</w:t>
       </w:r>
     </w:p>
     <w:tbl>
@@ -592,8 +1476,8 @@
       <w:tr>
         <w:tc>
           <w:tcPr>
-            <w:tcW w:type="dxa" w:w="2736"/>
-            <w:shd w:val="clear" w:fill="1f3d6b"/>
+            <w:tcW w:type="dxa" w:w="2304"/>
+            <w:shd w:val="clear" w:fill="4a5a72"/>
           </w:tcPr>
           <w:p>
             <w:r/>
@@ -609,8 +1493,8 @@
         </w:tc>
         <w:tc>
           <w:tcPr>
-            <w:tcW w:type="dxa" w:w="2448"/>
-            <w:shd w:val="clear" w:fill="1f3d6b"/>
+            <w:tcW w:type="dxa" w:w="2880"/>
+            <w:shd w:val="clear" w:fill="4a5a72"/>
           </w:tcPr>
           <w:p>
             <w:r/>
@@ -620,14 +1504,14 @@
                 <w:color w:val="FFFFFF"/>
                 <w:sz w:val="17"/>
               </w:rPr>
-              <w:t>Diamante 2026</w:t>
+              <w:t>Formula</w:t>
             </w:r>
           </w:p>
         </w:tc>
         <w:tc>
           <w:tcPr>
-            <w:tcW w:type="dxa" w:w="2448"/>
-            <w:shd w:val="clear" w:fill="1f3d6b"/>
+            <w:tcW w:type="dxa" w:w="2592"/>
+            <w:shd w:val="clear" w:fill="4a5a72"/>
           </w:tcPr>
           <w:p>
             <w:r/>
@@ -637,14 +1521,14 @@
                 <w:color w:val="FFFFFF"/>
                 <w:sz w:val="17"/>
               </w:rPr>
-              <w:t>Diamante 2025</w:t>
+              <w:t>2026: inputs → result</w:t>
             </w:r>
           </w:p>
         </w:tc>
         <w:tc>
           <w:tcPr>
-            <w:tcW w:type="dxa" w:w="2880"/>
-            <w:shd w:val="clear" w:fill="1f3d6b"/>
+            <w:tcW w:type="dxa" w:w="2592"/>
+            <w:shd w:val="clear" w:fill="4a5a72"/>
           </w:tcPr>
           <w:p>
             <w:r/>
@@ -654,7 +1538,7 @@
                 <w:color w:val="FFFFFF"/>
                 <w:sz w:val="17"/>
               </w:rPr>
-              <w:t>Insight</w:t>
+              <w:t>2025: inputs → result</w:t>
             </w:r>
           </w:p>
         </w:tc>
@@ -662,7 +1546,8 @@
       <w:tr>
         <w:tc>
           <w:tcPr>
-            <w:tcW w:type="dxa" w:w="2736"/>
+            <w:tcW w:type="dxa" w:w="2304"/>
+            <w:shd w:val="clear" w:fill="f4f6fa"/>
           </w:tcPr>
           <w:p>
             <w:r/>
@@ -670,13 +1555,14 @@
               <w:rPr>
                 <w:sz w:val="17"/>
               </w:rPr>
-              <w:t>Carats recovered / sold</w:t>
+              <w:t>Operating margin</w:t>
             </w:r>
           </w:p>
         </w:tc>
         <w:tc>
           <w:tcPr>
-            <w:tcW w:type="dxa" w:w="2448"/>
+            <w:tcW w:type="dxa" w:w="2880"/>
+            <w:shd w:val="clear" w:fill="f4f6fa"/>
           </w:tcPr>
           <w:p>
             <w:r/>
@@ -684,13 +1570,14 @@
               <w:rPr>
                 <w:sz w:val="17"/>
               </w:rPr>
-              <w:t>Not disclosed</w:t>
+              <w:t>Operating loss ÷ revenue</w:t>
             </w:r>
           </w:p>
         </w:tc>
         <w:tc>
           <w:tcPr>
-            <w:tcW w:type="dxa" w:w="2448"/>
+            <w:tcW w:type="dxa" w:w="2592"/>
+            <w:shd w:val="clear" w:fill="f4f6fa"/>
           </w:tcPr>
           <w:p>
             <w:r/>
@@ -698,13 +1585,14 @@
               <w:rPr>
                 <w:sz w:val="17"/>
               </w:rPr>
-              <w:t>Not disclosed</w:t>
+              <w:t>(1 638) ÷ 1 863 = (87.9%)</w:t>
             </w:r>
           </w:p>
         </w:tc>
         <w:tc>
           <w:tcPr>
-            <w:tcW w:type="dxa" w:w="2880"/>
+            <w:tcW w:type="dxa" w:w="2592"/>
+            <w:shd w:val="clear" w:fill="f4f6fa"/>
           </w:tcPr>
           <w:p>
             <w:r/>
@@ -712,7 +1600,7 @@
               <w:rPr>
                 <w:sz w:val="17"/>
               </w:rPr>
-              <w:t>No carat data is given, so per-carat KPIs cannot be computed; this data should be requested</w:t>
+              <w:t>(864) ÷ 2 790 = (31.0%)</w:t>
             </w:r>
           </w:p>
         </w:tc>
@@ -720,7 +1608,8 @@
       <w:tr>
         <w:tc>
           <w:tcPr>
-            <w:tcW w:type="dxa" w:w="2736"/>
+            <w:tcW w:type="dxa" w:w="2304"/>
+            <w:shd w:val="clear" w:fill="f4f6fa"/>
           </w:tcPr>
           <w:p>
             <w:r/>
@@ -728,13 +1617,14 @@
               <w:rPr>
                 <w:sz w:val="17"/>
               </w:rPr>
-              <w:t>Tonnes treated / grade / recovery</w:t>
+              <w:t>Operating margin excl. impairments</w:t>
             </w:r>
           </w:p>
         </w:tc>
         <w:tc>
           <w:tcPr>
-            <w:tcW w:type="dxa" w:w="2448"/>
+            <w:tcW w:type="dxa" w:w="2880"/>
+            <w:shd w:val="clear" w:fill="f4f6fa"/>
           </w:tcPr>
           <w:p>
             <w:r/>
@@ -742,13 +1632,14 @@
               <w:rPr>
                 <w:sz w:val="17"/>
               </w:rPr>
-              <w:t>Not disclosed</w:t>
+              <w:t>(Op loss + impairments) ÷ revenue</w:t>
             </w:r>
           </w:p>
         </w:tc>
         <w:tc>
           <w:tcPr>
-            <w:tcW w:type="dxa" w:w="2448"/>
+            <w:tcW w:type="dxa" w:w="2592"/>
+            <w:shd w:val="clear" w:fill="f4f6fa"/>
           </w:tcPr>
           <w:p>
             <w:r/>
@@ -756,13 +1647,14 @@
               <w:rPr>
                 <w:sz w:val="17"/>
               </w:rPr>
-              <w:t>Not disclosed</w:t>
+              <w:t>(1 638 + 1 170) ÷ 1 863 = (25.1%)</w:t>
             </w:r>
           </w:p>
         </w:tc>
         <w:tc>
           <w:tcPr>
-            <w:tcW w:type="dxa" w:w="2880"/>
+            <w:tcW w:type="dxa" w:w="2592"/>
+            <w:shd w:val="clear" w:fill="f4f6fa"/>
           </w:tcPr>
           <w:p>
             <w:r/>
@@ -770,7 +1662,7 @@
               <w:rPr>
                 <w:sz w:val="17"/>
               </w:rPr>
-              <w:t>Core operating metrics are absent from the pre-release</w:t>
+              <w:t>(864 + 729) ÷ 2 790 = (4.8%)</w:t>
             </w:r>
           </w:p>
         </w:tc>
@@ -778,7 +1670,8 @@
       <w:tr>
         <w:tc>
           <w:tcPr>
-            <w:tcW w:type="dxa" w:w="2736"/>
+            <w:tcW w:type="dxa" w:w="2304"/>
+            <w:shd w:val="clear" w:fill="f4f6fa"/>
           </w:tcPr>
           <w:p>
             <w:r/>
@@ -786,13 +1679,14 @@
               <w:rPr>
                 <w:sz w:val="17"/>
               </w:rPr>
-              <w:t>Revenue by mine</w:t>
+              <w:t>Adjusted EBITDA</w:t>
             </w:r>
           </w:p>
         </w:tc>
         <w:tc>
           <w:tcPr>
-            <w:tcW w:type="dxa" w:w="2448"/>
+            <w:tcW w:type="dxa" w:w="2880"/>
+            <w:shd w:val="clear" w:fill="f4f6fa"/>
           </w:tcPr>
           <w:p>
             <w:r/>
@@ -800,13 +1694,14 @@
               <w:rPr>
                 <w:sz w:val="17"/>
               </w:rPr>
-              <w:t>Mine 1 R1 233m; Mine 2 R630m</w:t>
+              <w:t>Op loss + depreciation + impairments</w:t>
             </w:r>
           </w:p>
         </w:tc>
         <w:tc>
           <w:tcPr>
-            <w:tcW w:type="dxa" w:w="2448"/>
+            <w:tcW w:type="dxa" w:w="2592"/>
+            <w:shd w:val="clear" w:fill="f4f6fa"/>
           </w:tcPr>
           <w:p>
             <w:r/>
@@ -814,13 +1709,14 @@
               <w:rPr>
                 <w:sz w:val="17"/>
               </w:rPr>
-              <w:t>Mine 1 R1 710m; Mine 2 R630→R1 080m</w:t>
+              <w:t>(1 638) + 675 + 1 170 = 207</w:t>
             </w:r>
           </w:p>
         </w:tc>
         <w:tc>
           <w:tcPr>
-            <w:tcW w:type="dxa" w:w="2880"/>
+            <w:tcW w:type="dxa" w:w="2592"/>
+            <w:shd w:val="clear" w:fill="f4f6fa"/>
           </w:tcPr>
           <w:p>
             <w:r/>
@@ -828,7 +1724,193 @@
               <w:rPr>
                 <w:sz w:val="17"/>
               </w:rPr>
-              <w:t>Mine 2 revenue fell 42% versus Mine 1’s 28%, so Mine 2 is the weaker asset</w:t>
+              <w:t>(864) + 675 + 729 = 540</w:t>
+            </w:r>
+          </w:p>
+        </w:tc>
+      </w:tr>
+      <w:tr>
+        <w:tc>
+          <w:tcPr>
+            <w:tcW w:type="dxa" w:w="2304"/>
+            <w:shd w:val="clear" w:fill="f4f6fa"/>
+          </w:tcPr>
+          <w:p>
+            <w:r/>
+            <w:r>
+              <w:rPr>
+                <w:sz w:val="17"/>
+              </w:rPr>
+              <w:t>EBITDA margin</w:t>
+            </w:r>
+          </w:p>
+        </w:tc>
+        <w:tc>
+          <w:tcPr>
+            <w:tcW w:type="dxa" w:w="2880"/>
+            <w:shd w:val="clear" w:fill="f4f6fa"/>
+          </w:tcPr>
+          <w:p>
+            <w:r/>
+            <w:r>
+              <w:rPr>
+                <w:sz w:val="17"/>
+              </w:rPr>
+              <w:t>Adjusted EBITDA ÷ revenue</w:t>
+            </w:r>
+          </w:p>
+        </w:tc>
+        <w:tc>
+          <w:tcPr>
+            <w:tcW w:type="dxa" w:w="2592"/>
+            <w:shd w:val="clear" w:fill="f4f6fa"/>
+          </w:tcPr>
+          <w:p>
+            <w:r/>
+            <w:r>
+              <w:rPr>
+                <w:sz w:val="17"/>
+              </w:rPr>
+              <w:t>207 ÷ 1 863 = 11.1%</w:t>
+            </w:r>
+          </w:p>
+        </w:tc>
+        <w:tc>
+          <w:tcPr>
+            <w:tcW w:type="dxa" w:w="2592"/>
+            <w:shd w:val="clear" w:fill="f4f6fa"/>
+          </w:tcPr>
+          <w:p>
+            <w:r/>
+            <w:r>
+              <w:rPr>
+                <w:sz w:val="17"/>
+              </w:rPr>
+              <w:t>540 ÷ 2 790 = 19.4%</w:t>
+            </w:r>
+          </w:p>
+        </w:tc>
+      </w:tr>
+      <w:tr>
+        <w:tc>
+          <w:tcPr>
+            <w:tcW w:type="dxa" w:w="2304"/>
+            <w:shd w:val="clear" w:fill="f4f6fa"/>
+          </w:tcPr>
+          <w:p>
+            <w:r/>
+            <w:r>
+              <w:rPr>
+                <w:sz w:val="17"/>
+              </w:rPr>
+              <w:t>Net margin</w:t>
+            </w:r>
+          </w:p>
+        </w:tc>
+        <w:tc>
+          <w:tcPr>
+            <w:tcW w:type="dxa" w:w="2880"/>
+            <w:shd w:val="clear" w:fill="f4f6fa"/>
+          </w:tcPr>
+          <w:p>
+            <w:r/>
+            <w:r>
+              <w:rPr>
+                <w:sz w:val="17"/>
+              </w:rPr>
+              <w:t>Loss for year ÷ revenue</w:t>
+            </w:r>
+          </w:p>
+        </w:tc>
+        <w:tc>
+          <w:tcPr>
+            <w:tcW w:type="dxa" w:w="2592"/>
+            <w:shd w:val="clear" w:fill="f4f6fa"/>
+          </w:tcPr>
+          <w:p>
+            <w:r/>
+            <w:r>
+              <w:rPr>
+                <w:sz w:val="17"/>
+              </w:rPr>
+              <w:t>(1 044) ÷ 1 863 = (56.0%)</w:t>
+            </w:r>
+          </w:p>
+        </w:tc>
+        <w:tc>
+          <w:tcPr>
+            <w:tcW w:type="dxa" w:w="2592"/>
+            <w:shd w:val="clear" w:fill="f4f6fa"/>
+          </w:tcPr>
+          <w:p>
+            <w:r/>
+            <w:r>
+              <w:rPr>
+                <w:sz w:val="17"/>
+              </w:rPr>
+              <w:t>(963) ÷ 2 790 = (34.5%)</w:t>
+            </w:r>
+          </w:p>
+        </w:tc>
+      </w:tr>
+      <w:tr>
+        <w:tc>
+          <w:tcPr>
+            <w:tcW w:type="dxa" w:w="2304"/>
+            <w:shd w:val="clear" w:fill="f4f6fa"/>
+          </w:tcPr>
+          <w:p>
+            <w:r/>
+            <w:r>
+              <w:rPr>
+                <w:sz w:val="17"/>
+              </w:rPr>
+              <w:t>Return on assets</w:t>
+            </w:r>
+          </w:p>
+        </w:tc>
+        <w:tc>
+          <w:tcPr>
+            <w:tcW w:type="dxa" w:w="2880"/>
+            <w:shd w:val="clear" w:fill="f4f6fa"/>
+          </w:tcPr>
+          <w:p>
+            <w:r/>
+            <w:r>
+              <w:rPr>
+                <w:sz w:val="17"/>
+              </w:rPr>
+              <w:t>Loss for year ÷ total assets</w:t>
+            </w:r>
+          </w:p>
+        </w:tc>
+        <w:tc>
+          <w:tcPr>
+            <w:tcW w:type="dxa" w:w="2592"/>
+            <w:shd w:val="clear" w:fill="f4f6fa"/>
+          </w:tcPr>
+          <w:p>
+            <w:r/>
+            <w:r>
+              <w:rPr>
+                <w:sz w:val="17"/>
+              </w:rPr>
+              <w:t>(1 044) ÷ 4 851 = (21.5%)</w:t>
+            </w:r>
+          </w:p>
+        </w:tc>
+        <w:tc>
+          <w:tcPr>
+            <w:tcW w:type="dxa" w:w="2592"/>
+            <w:shd w:val="clear" w:fill="f4f6fa"/>
+          </w:tcPr>
+          <w:p>
+            <w:r/>
+            <w:r>
+              <w:rPr>
+                <w:sz w:val="17"/>
+              </w:rPr>
+              <w:t>(963) ÷ 6 804 = (14.2%)</w:t>
             </w:r>
           </w:p>
         </w:tc>
@@ -836,7 +1918,57 @@
     </w:tbl>
     <w:p>
       <w:pPr>
-        <w:spacing w:before="100" w:after="20"/>
+        <w:spacing w:before="40" w:after="20"/>
+      </w:pPr>
+      <w:r>
+        <w:rPr>
+          <w:b/>
+          <w:i/>
+          <w:color w:val="555555"/>
+          <w:sz w:val="18"/>
+        </w:rPr>
+        <w:t>Analysis</w:t>
+      </w:r>
+    </w:p>
+    <w:p>
+      <w:pPr>
+        <w:pStyle w:val="ListBullet"/>
+        <w:spacing w:after="60"/>
+      </w:pPr>
+      <w:r>
+        <w:rPr>
+          <w:sz w:val="20"/>
+        </w:rPr>
+        <w:t>The mines are loss-making at every level, and the operating margin has worsened from (31.0%) to (87.9%).</w:t>
+      </w:r>
+    </w:p>
+    <w:p>
+      <w:pPr>
+        <w:pStyle w:val="ListBullet"/>
+        <w:spacing w:after="60"/>
+      </w:pPr>
+      <w:r>
+        <w:rPr>
+          <w:sz w:val="20"/>
+        </w:rPr>
+        <w:t>Even after removing the impairments, the operating margin is still (25.1%), which shows that the core mining loses money before any write-down.</w:t>
+      </w:r>
+    </w:p>
+    <w:p>
+      <w:pPr>
+        <w:pStyle w:val="ListBullet"/>
+        <w:spacing w:after="60"/>
+      </w:pPr>
+      <w:r>
+        <w:rPr>
+          <w:sz w:val="20"/>
+        </w:rPr>
+        <w:t>Adjusted EBITDA is still positive at R207m, but it has more than halved from R540m, so the underlying cash earnings are shrinking fast.</w:t>
+      </w:r>
+    </w:p>
+    <w:p>
+      <w:pPr>
+        <w:spacing w:before="120" w:after="20"/>
       </w:pPr>
       <w:r>
         <w:rPr>
@@ -844,7 +1976,21 @@
           <w:color w:val="1F3D6B"/>
           <w:sz w:val="22"/>
         </w:rPr>
-        <w:t>2.2 Value and pricing</w:t>
+        <w:t>2.2 Cost efficiency</w:t>
+      </w:r>
+    </w:p>
+    <w:p>
+      <w:pPr>
+        <w:spacing w:before="40" w:after="20"/>
+      </w:pPr>
+      <w:r>
+        <w:rPr>
+          <w:b/>
+          <w:i/>
+          <w:color w:val="555555"/>
+          <w:sz w:val="18"/>
+        </w:rPr>
+        <w:t>Formula and inputs</w:t>
       </w:r>
     </w:p>
     <w:tbl>
@@ -863,8 +2009,8 @@
       <w:tr>
         <w:tc>
           <w:tcPr>
-            <w:tcW w:type="dxa" w:w="2448"/>
-            <w:shd w:val="clear" w:fill="1f3d6b"/>
+            <w:tcW w:type="dxa" w:w="2160"/>
+            <w:shd w:val="clear" w:fill="4a5a72"/>
           </w:tcPr>
           <w:p>
             <w:r/>
@@ -880,8 +2026,8 @@
         </w:tc>
         <w:tc>
           <w:tcPr>
-            <w:tcW w:type="dxa" w:w="2448"/>
-            <w:shd w:val="clear" w:fill="1f3d6b"/>
+            <w:tcW w:type="dxa" w:w="3024"/>
+            <w:shd w:val="clear" w:fill="4a5a72"/>
           </w:tcPr>
           <w:p>
             <w:r/>
@@ -897,8 +2043,8 @@
         </w:tc>
         <w:tc>
           <w:tcPr>
-            <w:tcW w:type="dxa" w:w="2736"/>
-            <w:shd w:val="clear" w:fill="1f3d6b"/>
+            <w:tcW w:type="dxa" w:w="2592"/>
+            <w:shd w:val="clear" w:fill="4a5a72"/>
           </w:tcPr>
           <w:p>
             <w:r/>
@@ -908,14 +2054,14 @@
                 <w:color w:val="FFFFFF"/>
                 <w:sz w:val="17"/>
               </w:rPr>
-              <w:t>Diamante</w:t>
+              <w:t>2026: inputs → result</w:t>
             </w:r>
           </w:p>
         </w:tc>
         <w:tc>
           <w:tcPr>
-            <w:tcW w:type="dxa" w:w="2880"/>
-            <w:shd w:val="clear" w:fill="1f3d6b"/>
+            <w:tcW w:type="dxa" w:w="2592"/>
+            <w:shd w:val="clear" w:fill="4a5a72"/>
           </w:tcPr>
           <w:p>
             <w:r/>
@@ -925,296 +2071,7 @@
                 <w:color w:val="FFFFFF"/>
                 <w:sz w:val="17"/>
               </w:rPr>
-              <w:t>Insight</w:t>
-            </w:r>
-          </w:p>
-        </w:tc>
-      </w:tr>
-      <w:tr>
-        <w:tc>
-          <w:tcPr>
-            <w:tcW w:type="dxa" w:w="2448"/>
-          </w:tcPr>
-          <w:p>
-            <w:r/>
-            <w:r>
-              <w:rPr>
-                <w:sz w:val="17"/>
-              </w:rPr>
-              <w:t>Realised US$ per carat</w:t>
-            </w:r>
-          </w:p>
-        </w:tc>
-        <w:tc>
-          <w:tcPr>
-            <w:tcW w:type="dxa" w:w="2448"/>
-          </w:tcPr>
-          <w:p>
-            <w:r/>
-            <w:r>
-              <w:rPr>
-                <w:sz w:val="17"/>
-              </w:rPr>
-              <w:t>Revenue ÷ carats sold</w:t>
-            </w:r>
-          </w:p>
-        </w:tc>
-        <w:tc>
-          <w:tcPr>
-            <w:tcW w:type="dxa" w:w="2736"/>
-          </w:tcPr>
-          <w:p>
-            <w:r/>
-            <w:r>
-              <w:rPr>
-                <w:sz w:val="17"/>
-              </w:rPr>
-              <w:t>Cannot compute (carats not disclosed)</w:t>
-            </w:r>
-          </w:p>
-        </w:tc>
-        <w:tc>
-          <w:tcPr>
-            <w:tcW w:type="dxa" w:w="2880"/>
-          </w:tcPr>
-          <w:p>
-            <w:r/>
-            <w:r>
-              <w:rPr>
-                <w:sz w:val="17"/>
-              </w:rPr>
-              <w:t>This is the single most important value KPI and Diamante does not disclose it</w:t>
-            </w:r>
-          </w:p>
-        </w:tc>
-      </w:tr>
-      <w:tr>
-        <w:tc>
-          <w:tcPr>
-            <w:tcW w:type="dxa" w:w="2448"/>
-          </w:tcPr>
-          <w:p>
-            <w:r/>
-            <w:r>
-              <w:rPr>
-                <w:sz w:val="17"/>
-              </w:rPr>
-              <w:t>Revenue mix by market</w:t>
-            </w:r>
-          </w:p>
-        </w:tc>
-        <w:tc>
-          <w:tcPr>
-            <w:tcW w:type="dxa" w:w="2448"/>
-          </w:tcPr>
-          <w:p>
-            <w:r/>
-            <w:r>
-              <w:rPr>
-                <w:sz w:val="17"/>
-              </w:rPr>
-              <w:t>Revenue by geography</w:t>
-            </w:r>
-          </w:p>
-        </w:tc>
-        <w:tc>
-          <w:tcPr>
-            <w:tcW w:type="dxa" w:w="2736"/>
-          </w:tcPr>
-          <w:p>
-            <w:r/>
-            <w:r>
-              <w:rPr>
-                <w:sz w:val="17"/>
-              </w:rPr>
-              <w:t>US 52%; India 11%; China 10%; rest 27%</w:t>
-            </w:r>
-          </w:p>
-        </w:tc>
-        <w:tc>
-          <w:tcPr>
-            <w:tcW w:type="dxa" w:w="2880"/>
-          </w:tcPr>
-          <w:p>
-            <w:r/>
-            <w:r>
-              <w:rPr>
-                <w:sz w:val="17"/>
-              </w:rPr>
-              <w:t>Heavy reliance on the US, which is expected to be flat, so the growth is dependent on India</w:t>
-            </w:r>
-          </w:p>
-        </w:tc>
-      </w:tr>
-      <w:tr>
-        <w:tc>
-          <w:tcPr>
-            <w:tcW w:type="dxa" w:w="2448"/>
-          </w:tcPr>
-          <w:p>
-            <w:r/>
-            <w:r>
-              <w:rPr>
-                <w:sz w:val="17"/>
-              </w:rPr>
-              <w:t>Revenue change</w:t>
-            </w:r>
-          </w:p>
-        </w:tc>
-        <w:tc>
-          <w:tcPr>
-            <w:tcW w:type="dxa" w:w="2448"/>
-          </w:tcPr>
-          <w:p>
-            <w:r/>
-            <w:r>
-              <w:rPr>
-                <w:sz w:val="17"/>
-              </w:rPr>
-              <w:t>Year-on-year</w:t>
-            </w:r>
-          </w:p>
-        </w:tc>
-        <w:tc>
-          <w:tcPr>
-            <w:tcW w:type="dxa" w:w="2736"/>
-          </w:tcPr>
-          <w:p>
-            <w:r/>
-            <w:r>
-              <w:rPr>
-                <w:sz w:val="17"/>
-              </w:rPr>
-              <w:t>R1 863m vs R2 790m = −33%</w:t>
-            </w:r>
-          </w:p>
-        </w:tc>
-        <w:tc>
-          <w:tcPr>
-            <w:tcW w:type="dxa" w:w="2880"/>
-          </w:tcPr>
-          <w:p>
-            <w:r/>
-            <w:r>
-              <w:rPr>
-                <w:sz w:val="17"/>
-              </w:rPr>
-              <w:t>Revenue fell a third, driven by weak prices and deferred tenders</w:t>
-            </w:r>
-          </w:p>
-        </w:tc>
-      </w:tr>
-    </w:tbl>
-    <w:p>
-      <w:pPr>
-        <w:spacing w:before="100" w:after="20"/>
-      </w:pPr>
-      <w:r>
-        <w:rPr>
-          <w:b/>
-          <w:color w:val="1F3D6B"/>
-          <w:sz w:val="22"/>
-        </w:rPr>
-        <w:t>2.3 Cost efficiency</w:t>
-      </w:r>
-    </w:p>
-    <w:tbl>
-      <w:tblPr>
-        <w:tblStyle w:val="TableGrid"/>
-        <w:tblW w:type="auto" w:w="0"/>
-        <w:jc w:val="center"/>
-        <w:tblLook w:firstColumn="1" w:firstRow="1" w:lastColumn="0" w:lastRow="0" w:noHBand="0" w:noVBand="1" w:val="04A0"/>
-      </w:tblPr>
-      <w:tblGrid>
-        <w:gridCol w:w="2131"/>
-        <w:gridCol w:w="2131"/>
-        <w:gridCol w:w="2131"/>
-        <w:gridCol w:w="2131"/>
-        <w:gridCol w:w="2131"/>
-      </w:tblGrid>
-      <w:tr>
-        <w:tc>
-          <w:tcPr>
-            <w:tcW w:type="dxa" w:w="2160"/>
-            <w:shd w:val="clear" w:fill="1f3d6b"/>
-          </w:tcPr>
-          <w:p>
-            <w:r/>
-            <w:r>
-              <w:rPr>
-                <w:b/>
-                <w:color w:val="FFFFFF"/>
-                <w:sz w:val="17"/>
-              </w:rPr>
-              <w:t>KPI</w:t>
-            </w:r>
-          </w:p>
-        </w:tc>
-        <w:tc>
-          <w:tcPr>
-            <w:tcW w:type="dxa" w:w="2304"/>
-            <w:shd w:val="clear" w:fill="1f3d6b"/>
-          </w:tcPr>
-          <w:p>
-            <w:r/>
-            <w:r>
-              <w:rPr>
-                <w:b/>
-                <w:color w:val="FFFFFF"/>
-                <w:sz w:val="17"/>
-              </w:rPr>
-              <w:t>Formula</w:t>
-            </w:r>
-          </w:p>
-        </w:tc>
-        <w:tc>
-          <w:tcPr>
-            <w:tcW w:type="dxa" w:w="1440"/>
-            <w:shd w:val="clear" w:fill="1f3d6b"/>
-          </w:tcPr>
-          <w:p>
-            <w:r/>
-            <w:r>
-              <w:rPr>
-                <w:b/>
-                <w:color w:val="FFFFFF"/>
-                <w:sz w:val="17"/>
-              </w:rPr>
-              <w:t>2026</w:t>
-            </w:r>
-          </w:p>
-        </w:tc>
-        <w:tc>
-          <w:tcPr>
-            <w:tcW w:type="dxa" w:w="1440"/>
-            <w:shd w:val="clear" w:fill="1f3d6b"/>
-          </w:tcPr>
-          <w:p>
-            <w:r/>
-            <w:r>
-              <w:rPr>
-                <w:b/>
-                <w:color w:val="FFFFFF"/>
-                <w:sz w:val="17"/>
-              </w:rPr>
-              <w:t>2025</w:t>
-            </w:r>
-          </w:p>
-        </w:tc>
-        <w:tc>
-          <w:tcPr>
-            <w:tcW w:type="dxa" w:w="3024"/>
-            <w:shd w:val="clear" w:fill="1f3d6b"/>
-          </w:tcPr>
-          <w:p>
-            <w:r/>
-            <w:r>
-              <w:rPr>
-                <w:b/>
-                <w:color w:val="FFFFFF"/>
-                <w:sz w:val="17"/>
-              </w:rPr>
-              <w:t>Insight</w:t>
+              <w:t>2025: inputs → result</w:t>
             </w:r>
           </w:p>
         </w:tc>
@@ -1223,6 +2080,7 @@
         <w:tc>
           <w:tcPr>
             <w:tcW w:type="dxa" w:w="2160"/>
+            <w:shd w:val="clear" w:fill="f4f6fa"/>
           </w:tcPr>
           <w:p>
             <w:r/>
@@ -1236,7 +2094,8 @@
         </w:tc>
         <w:tc>
           <w:tcPr>
-            <w:tcW w:type="dxa" w:w="2304"/>
+            <w:tcW w:type="dxa" w:w="3024"/>
+            <w:shd w:val="clear" w:fill="f4f6fa"/>
           </w:tcPr>
           <w:p>
             <w:r/>
@@ -1244,13 +2103,29 @@
               <w:rPr>
                 <w:sz w:val="17"/>
               </w:rPr>
-              <w:t>Mining costs ÷ carats</w:t>
+              <w:t>Mining costs ÷ carats recovered</w:t>
             </w:r>
           </w:p>
         </w:tc>
         <w:tc>
           <w:tcPr>
-            <w:tcW w:type="dxa" w:w="1440"/>
+            <w:tcW w:type="dxa" w:w="2592"/>
+            <w:shd w:val="clear" w:fill="f4f6fa"/>
+          </w:tcPr>
+          <w:p>
+            <w:r/>
+            <w:r>
+              <w:rPr>
+                <w:sz w:val="17"/>
+              </w:rPr>
+              <w:t>Cannot compute — carats not disclosed</w:t>
+            </w:r>
+          </w:p>
+        </w:tc>
+        <w:tc>
+          <w:tcPr>
+            <w:tcW w:type="dxa" w:w="2592"/>
+            <w:shd w:val="clear" w:fill="f4f6fa"/>
           </w:tcPr>
           <w:p>
             <w:r/>
@@ -1262,39 +2137,12 @@
             </w:r>
           </w:p>
         </w:tc>
-        <w:tc>
-          <w:tcPr>
-            <w:tcW w:type="dxa" w:w="1440"/>
-          </w:tcPr>
-          <w:p>
-            <w:r/>
-            <w:r>
-              <w:rPr>
-                <w:sz w:val="17"/>
-              </w:rPr>
-              <w:t>Cannot compute</w:t>
-            </w:r>
-          </w:p>
-        </w:tc>
-        <w:tc>
-          <w:tcPr>
-            <w:tcW w:type="dxa" w:w="3024"/>
-          </w:tcPr>
-          <w:p>
-            <w:r/>
-            <w:r>
-              <w:rPr>
-                <w:sz w:val="17"/>
-              </w:rPr>
-              <w:t>The standard cost measure cannot be computed without carats</w:t>
-            </w:r>
-          </w:p>
-        </w:tc>
       </w:tr>
       <w:tr>
         <w:tc>
           <w:tcPr>
             <w:tcW w:type="dxa" w:w="2160"/>
+            <w:shd w:val="clear" w:fill="f4f6fa"/>
           </w:tcPr>
           <w:p>
             <w:r/>
@@ -1308,7 +2156,8 @@
         </w:tc>
         <w:tc>
           <w:tcPr>
-            <w:tcW w:type="dxa" w:w="2304"/>
+            <w:tcW w:type="dxa" w:w="3024"/>
+            <w:shd w:val="clear" w:fill="f4f6fa"/>
           </w:tcPr>
           <w:p>
             <w:r/>
@@ -1322,7 +2171,8 @@
         </w:tc>
         <w:tc>
           <w:tcPr>
-            <w:tcW w:type="dxa" w:w="1440"/>
+            <w:tcW w:type="dxa" w:w="2592"/>
+            <w:shd w:val="clear" w:fill="f4f6fa"/>
           </w:tcPr>
           <w:p>
             <w:r/>
@@ -1330,13 +2180,14 @@
               <w:rPr>
                 <w:sz w:val="17"/>
               </w:rPr>
-              <w:t>123%</w:t>
+              <w:t>2 295 ÷ 1 863 = 123%</w:t>
             </w:r>
           </w:p>
         </w:tc>
         <w:tc>
           <w:tcPr>
-            <w:tcW w:type="dxa" w:w="1440"/>
+            <w:tcW w:type="dxa" w:w="2592"/>
+            <w:shd w:val="clear" w:fill="f4f6fa"/>
           </w:tcPr>
           <w:p>
             <w:r/>
@@ -1344,21 +2195,7 @@
               <w:rPr>
                 <w:sz w:val="17"/>
               </w:rPr>
-              <w:t>101%</w:t>
-            </w:r>
-          </w:p>
-        </w:tc>
-        <w:tc>
-          <w:tcPr>
-            <w:tcW w:type="dxa" w:w="3024"/>
-          </w:tcPr>
-          <w:p>
-            <w:r/>
-            <w:r>
-              <w:rPr>
-                <w:sz w:val="17"/>
-              </w:rPr>
-              <w:t>Mining costs now exceed revenue, so the mines lose money at cost level</w:t>
+              <w:t>2 817 ÷ 2 790 = 101%</w:t>
             </w:r>
           </w:p>
         </w:tc>
@@ -1367,6 +2204,7 @@
         <w:tc>
           <w:tcPr>
             <w:tcW w:type="dxa" w:w="2160"/>
+            <w:shd w:val="clear" w:fill="f4f6fa"/>
           </w:tcPr>
           <w:p>
             <w:r/>
@@ -1380,7 +2218,8 @@
         </w:tc>
         <w:tc>
           <w:tcPr>
-            <w:tcW w:type="dxa" w:w="2304"/>
+            <w:tcW w:type="dxa" w:w="3024"/>
+            <w:shd w:val="clear" w:fill="f4f6fa"/>
           </w:tcPr>
           <w:p>
             <w:r/>
@@ -1388,13 +2227,14 @@
               <w:rPr>
                 <w:sz w:val="17"/>
               </w:rPr>
-              <w:t>Year-on-year</w:t>
+              <w:t>(This year − last year) ÷ last year</w:t>
             </w:r>
           </w:p>
         </w:tc>
         <w:tc>
           <w:tcPr>
-            <w:tcW w:type="dxa" w:w="1440"/>
+            <w:tcW w:type="dxa" w:w="2592"/>
+            <w:shd w:val="clear" w:fill="f4f6fa"/>
           </w:tcPr>
           <w:p>
             <w:r/>
@@ -1402,13 +2242,14 @@
               <w:rPr>
                 <w:sz w:val="17"/>
               </w:rPr>
-              <w:t>R2 295m vs R2 817m = −18.5%</w:t>
+              <w:t>(2 295 − 2 817) ÷ 2 817 = (18.5%)</w:t>
             </w:r>
           </w:p>
         </w:tc>
         <w:tc>
           <w:tcPr>
-            <w:tcW w:type="dxa" w:w="1440"/>
+            <w:tcW w:type="dxa" w:w="2592"/>
+            <w:shd w:val="clear" w:fill="f4f6fa"/>
           </w:tcPr>
           <w:p>
             <w:r/>
@@ -1416,20 +2257,7 @@
               <w:rPr>
                 <w:sz w:val="17"/>
               </w:rPr>
-            </w:r>
-          </w:p>
-        </w:tc>
-        <w:tc>
-          <w:tcPr>
-            <w:tcW w:type="dxa" w:w="3024"/>
-          </w:tcPr>
-          <w:p>
-            <w:r/>
-            <w:r>
-              <w:rPr>
-                <w:sz w:val="17"/>
-              </w:rPr>
-              <w:t>Costs fell far below inflation, but partly by mining less and cutting employee costs 11%</w:t>
+              <w:t>—</w:t>
             </w:r>
           </w:p>
         </w:tc>
@@ -1437,7 +2265,57 @@
     </w:tbl>
     <w:p>
       <w:pPr>
-        <w:spacing w:before="100" w:after="20"/>
+        <w:spacing w:before="40" w:after="20"/>
+      </w:pPr>
+      <w:r>
+        <w:rPr>
+          <w:b/>
+          <w:i/>
+          <w:color w:val="555555"/>
+          <w:sz w:val="18"/>
+        </w:rPr>
+        <w:t>Analysis</w:t>
+      </w:r>
+    </w:p>
+    <w:p>
+      <w:pPr>
+        <w:pStyle w:val="ListBullet"/>
+        <w:spacing w:after="60"/>
+      </w:pPr>
+      <w:r>
+        <w:rPr>
+          <w:sz w:val="20"/>
+        </w:rPr>
+        <w:t>Mining costs now exceed revenue (123%), so each rand of sales does not even cover the cost of mining it.</w:t>
+      </w:r>
+    </w:p>
+    <w:p>
+      <w:pPr>
+        <w:pStyle w:val="ListBullet"/>
+        <w:spacing w:after="60"/>
+      </w:pPr>
+      <w:r>
+        <w:rPr>
+          <w:sz w:val="20"/>
+        </w:rPr>
+        <w:t>Costs fell 18.5%, which is far below inflation, but this was achieved partly by mining less and by cutting employee costs by 11%, so it may not reflect real efficiency.</w:t>
+      </w:r>
+    </w:p>
+    <w:p>
+      <w:pPr>
+        <w:pStyle w:val="ListBullet"/>
+        <w:spacing w:after="60"/>
+      </w:pPr>
+      <w:r>
+        <w:rPr>
+          <w:sz w:val="20"/>
+        </w:rPr>
+        <w:t>Without carats, the true efficiency measure of cost per carat cannot be calculated, which is a gap the company should close.</w:t>
+      </w:r>
+    </w:p>
+    <w:p>
+      <w:pPr>
+        <w:spacing w:before="120" w:after="20"/>
       </w:pPr>
       <w:r>
         <w:rPr>
@@ -1445,1100 +2323,21 @@
           <w:color w:val="1F3D6B"/>
           <w:sz w:val="22"/>
         </w:rPr>
-        <w:t>2.4 Profitability</w:t>
+        <w:t>2.3 Cash and balance sheet</w:t>
       </w:r>
     </w:p>
-    <w:tbl>
-      <w:tblPr>
-        <w:tblStyle w:val="TableGrid"/>
-        <w:tblW w:type="auto" w:w="0"/>
-        <w:jc w:val="center"/>
-        <w:tblLook w:firstColumn="1" w:firstRow="1" w:lastColumn="0" w:lastRow="0" w:noHBand="0" w:noVBand="1" w:val="04A0"/>
-      </w:tblPr>
-      <w:tblGrid>
-        <w:gridCol w:w="2131"/>
-        <w:gridCol w:w="2131"/>
-        <w:gridCol w:w="2131"/>
-        <w:gridCol w:w="2131"/>
-        <w:gridCol w:w="2131"/>
-      </w:tblGrid>
-      <w:tr>
-        <w:tc>
-          <w:tcPr>
-            <w:tcW w:type="dxa" w:w="2304"/>
-            <w:shd w:val="clear" w:fill="1f3d6b"/>
-          </w:tcPr>
-          <w:p>
-            <w:r/>
-            <w:r>
-              <w:rPr>
-                <w:b/>
-                <w:color w:val="FFFFFF"/>
-                <w:sz w:val="17"/>
-              </w:rPr>
-              <w:t>KPI</w:t>
-            </w:r>
-          </w:p>
-        </w:tc>
-        <w:tc>
-          <w:tcPr>
-            <w:tcW w:type="dxa" w:w="2880"/>
-            <w:shd w:val="clear" w:fill="1f3d6b"/>
-          </w:tcPr>
-          <w:p>
-            <w:r/>
-            <w:r>
-              <w:rPr>
-                <w:b/>
-                <w:color w:val="FFFFFF"/>
-                <w:sz w:val="17"/>
-              </w:rPr>
-              <w:t>Formula</w:t>
-            </w:r>
-          </w:p>
-        </w:tc>
-        <w:tc>
-          <w:tcPr>
-            <w:tcW w:type="dxa" w:w="1224"/>
-            <w:shd w:val="clear" w:fill="1f3d6b"/>
-          </w:tcPr>
-          <w:p>
-            <w:r/>
-            <w:r>
-              <w:rPr>
-                <w:b/>
-                <w:color w:val="FFFFFF"/>
-                <w:sz w:val="17"/>
-              </w:rPr>
-              <w:t>2026</w:t>
-            </w:r>
-          </w:p>
-        </w:tc>
-        <w:tc>
-          <w:tcPr>
-            <w:tcW w:type="dxa" w:w="1224"/>
-            <w:shd w:val="clear" w:fill="1f3d6b"/>
-          </w:tcPr>
-          <w:p>
-            <w:r/>
-            <w:r>
-              <w:rPr>
-                <w:b/>
-                <w:color w:val="FFFFFF"/>
-                <w:sz w:val="17"/>
-              </w:rPr>
-              <w:t>2025</w:t>
-            </w:r>
-          </w:p>
-        </w:tc>
-        <w:tc>
-          <w:tcPr>
-            <w:tcW w:type="dxa" w:w="2736"/>
-            <w:shd w:val="clear" w:fill="1f3d6b"/>
-          </w:tcPr>
-          <w:p>
-            <w:r/>
-            <w:r>
-              <w:rPr>
-                <w:b/>
-                <w:color w:val="FFFFFF"/>
-                <w:sz w:val="17"/>
-              </w:rPr>
-              <w:t>Insight</w:t>
-            </w:r>
-          </w:p>
-        </w:tc>
-      </w:tr>
-      <w:tr>
-        <w:tc>
-          <w:tcPr>
-            <w:tcW w:type="dxa" w:w="2304"/>
-          </w:tcPr>
-          <w:p>
-            <w:r/>
-            <w:r>
-              <w:rPr>
-                <w:sz w:val="17"/>
-              </w:rPr>
-              <w:t>Operating margin</w:t>
-            </w:r>
-          </w:p>
-        </w:tc>
-        <w:tc>
-          <w:tcPr>
-            <w:tcW w:type="dxa" w:w="2880"/>
-          </w:tcPr>
-          <w:p>
-            <w:r/>
-            <w:r>
-              <w:rPr>
-                <w:sz w:val="17"/>
-              </w:rPr>
-              <w:t>Operating loss ÷ revenue</w:t>
-            </w:r>
-          </w:p>
-        </w:tc>
-        <w:tc>
-          <w:tcPr>
-            <w:tcW w:type="dxa" w:w="1224"/>
-          </w:tcPr>
-          <w:p>
-            <w:r/>
-            <w:r>
-              <w:rPr>
-                <w:sz w:val="17"/>
-              </w:rPr>
-              <w:t>(87.9%)</w:t>
-            </w:r>
-          </w:p>
-        </w:tc>
-        <w:tc>
-          <w:tcPr>
-            <w:tcW w:type="dxa" w:w="1224"/>
-          </w:tcPr>
-          <w:p>
-            <w:r/>
-            <w:r>
-              <w:rPr>
-                <w:sz w:val="17"/>
-              </w:rPr>
-              <w:t>(31.0%)</w:t>
-            </w:r>
-          </w:p>
-        </w:tc>
-        <w:tc>
-          <w:tcPr>
-            <w:tcW w:type="dxa" w:w="2736"/>
-          </w:tcPr>
-          <w:p>
-            <w:r/>
-            <w:r>
-              <w:rPr>
-                <w:sz w:val="17"/>
-              </w:rPr>
-              <w:t>Deep operating loss, nearly three times worse</w:t>
-            </w:r>
-          </w:p>
-        </w:tc>
-      </w:tr>
-      <w:tr>
-        <w:tc>
-          <w:tcPr>
-            <w:tcW w:type="dxa" w:w="2304"/>
-          </w:tcPr>
-          <w:p>
-            <w:r/>
-            <w:r>
-              <w:rPr>
-                <w:sz w:val="17"/>
-              </w:rPr>
-              <w:t>Operating margin excl. impairments</w:t>
-            </w:r>
-          </w:p>
-        </w:tc>
-        <w:tc>
-          <w:tcPr>
-            <w:tcW w:type="dxa" w:w="2880"/>
-          </w:tcPr>
-          <w:p>
-            <w:r/>
-            <w:r>
-              <w:rPr>
-                <w:sz w:val="17"/>
-              </w:rPr>
-              <w:t>(Op loss + impairments) ÷ revenue</w:t>
-            </w:r>
-          </w:p>
-        </w:tc>
-        <w:tc>
-          <w:tcPr>
-            <w:tcW w:type="dxa" w:w="1224"/>
-          </w:tcPr>
-          <w:p>
-            <w:r/>
-            <w:r>
-              <w:rPr>
-                <w:sz w:val="17"/>
-              </w:rPr>
-              <w:t>(25.1%)</w:t>
-            </w:r>
-          </w:p>
-        </w:tc>
-        <w:tc>
-          <w:tcPr>
-            <w:tcW w:type="dxa" w:w="1224"/>
-          </w:tcPr>
-          <w:p>
-            <w:r/>
-            <w:r>
-              <w:rPr>
-                <w:sz w:val="17"/>
-              </w:rPr>
-              <w:t>(4.8%)</w:t>
-            </w:r>
-          </w:p>
-        </w:tc>
-        <w:tc>
-          <w:tcPr>
-            <w:tcW w:type="dxa" w:w="2736"/>
-          </w:tcPr>
-          <w:p>
-            <w:r/>
-            <w:r>
-              <w:rPr>
-                <w:sz w:val="17"/>
-              </w:rPr>
-              <w:t>Even before impairments the mines are loss-making</w:t>
-            </w:r>
-          </w:p>
-        </w:tc>
-      </w:tr>
-      <w:tr>
-        <w:tc>
-          <w:tcPr>
-            <w:tcW w:type="dxa" w:w="2304"/>
-          </w:tcPr>
-          <w:p>
-            <w:r/>
-            <w:r>
-              <w:rPr>
-                <w:sz w:val="17"/>
-              </w:rPr>
-              <w:t>Adjusted EBITDA</w:t>
-            </w:r>
-          </w:p>
-        </w:tc>
-        <w:tc>
-          <w:tcPr>
-            <w:tcW w:type="dxa" w:w="2880"/>
-          </w:tcPr>
-          <w:p>
-            <w:r/>
-            <w:r>
-              <w:rPr>
-                <w:sz w:val="17"/>
-              </w:rPr>
-              <w:t>Op loss + depreciation + impairments</w:t>
-            </w:r>
-          </w:p>
-        </w:tc>
-        <w:tc>
-          <w:tcPr>
-            <w:tcW w:type="dxa" w:w="1224"/>
-          </w:tcPr>
-          <w:p>
-            <w:r/>
-            <w:r>
-              <w:rPr>
-                <w:sz w:val="17"/>
-              </w:rPr>
-              <w:t>207</w:t>
-            </w:r>
-          </w:p>
-        </w:tc>
-        <w:tc>
-          <w:tcPr>
-            <w:tcW w:type="dxa" w:w="1224"/>
-          </w:tcPr>
-          <w:p>
-            <w:r/>
-            <w:r>
-              <w:rPr>
-                <w:sz w:val="17"/>
-              </w:rPr>
-              <w:t>540</w:t>
-            </w:r>
-          </w:p>
-        </w:tc>
-        <w:tc>
-          <w:tcPr>
-            <w:tcW w:type="dxa" w:w="2736"/>
-          </w:tcPr>
-          <w:p>
-            <w:r/>
-            <w:r>
-              <w:rPr>
-                <w:sz w:val="17"/>
-              </w:rPr>
-              <w:t>Cash earnings are positive but more than halved</w:t>
-            </w:r>
-          </w:p>
-        </w:tc>
-      </w:tr>
-      <w:tr>
-        <w:tc>
-          <w:tcPr>
-            <w:tcW w:type="dxa" w:w="2304"/>
-          </w:tcPr>
-          <w:p>
-            <w:r/>
-            <w:r>
-              <w:rPr>
-                <w:sz w:val="17"/>
-              </w:rPr>
-              <w:t>EBITDA margin</w:t>
-            </w:r>
-          </w:p>
-        </w:tc>
-        <w:tc>
-          <w:tcPr>
-            <w:tcW w:type="dxa" w:w="2880"/>
-          </w:tcPr>
-          <w:p>
-            <w:r/>
-            <w:r>
-              <w:rPr>
-                <w:sz w:val="17"/>
-              </w:rPr>
-              <w:t>EBITDA ÷ revenue</w:t>
-            </w:r>
-          </w:p>
-        </w:tc>
-        <w:tc>
-          <w:tcPr>
-            <w:tcW w:type="dxa" w:w="1224"/>
-          </w:tcPr>
-          <w:p>
-            <w:r/>
-            <w:r>
-              <w:rPr>
-                <w:sz w:val="17"/>
-              </w:rPr>
-              <w:t>11.1%</w:t>
-            </w:r>
-          </w:p>
-        </w:tc>
-        <w:tc>
-          <w:tcPr>
-            <w:tcW w:type="dxa" w:w="1224"/>
-          </w:tcPr>
-          <w:p>
-            <w:r/>
-            <w:r>
-              <w:rPr>
-                <w:sz w:val="17"/>
-              </w:rPr>
-              <w:t>19.4%</w:t>
-            </w:r>
-          </w:p>
-        </w:tc>
-        <w:tc>
-          <w:tcPr>
-            <w:tcW w:type="dxa" w:w="2736"/>
-          </w:tcPr>
-          <w:p>
-            <w:r/>
-            <w:r>
-              <w:rPr>
-                <w:sz w:val="17"/>
-              </w:rPr>
-              <w:t>Margin has fallen sharply</w:t>
-            </w:r>
-          </w:p>
-        </w:tc>
-      </w:tr>
-      <w:tr>
-        <w:tc>
-          <w:tcPr>
-            <w:tcW w:type="dxa" w:w="2304"/>
-          </w:tcPr>
-          <w:p>
-            <w:r/>
-            <w:r>
-              <w:rPr>
-                <w:sz w:val="17"/>
-              </w:rPr>
-              <w:t>Net margin</w:t>
-            </w:r>
-          </w:p>
-        </w:tc>
-        <w:tc>
-          <w:tcPr>
-            <w:tcW w:type="dxa" w:w="2880"/>
-          </w:tcPr>
-          <w:p>
-            <w:r/>
-            <w:r>
-              <w:rPr>
-                <w:sz w:val="17"/>
-              </w:rPr>
-              <w:t>Loss for year ÷ revenue</w:t>
-            </w:r>
-          </w:p>
-        </w:tc>
-        <w:tc>
-          <w:tcPr>
-            <w:tcW w:type="dxa" w:w="1224"/>
-          </w:tcPr>
-          <w:p>
-            <w:r/>
-            <w:r>
-              <w:rPr>
-                <w:sz w:val="17"/>
-              </w:rPr>
-              <w:t>(56.0%)</w:t>
-            </w:r>
-          </w:p>
-        </w:tc>
-        <w:tc>
-          <w:tcPr>
-            <w:tcW w:type="dxa" w:w="1224"/>
-          </w:tcPr>
-          <w:p>
-            <w:r/>
-            <w:r>
-              <w:rPr>
-                <w:sz w:val="17"/>
-              </w:rPr>
-              <w:t>(34.5%)</w:t>
-            </w:r>
-          </w:p>
-        </w:tc>
-        <w:tc>
-          <w:tcPr>
-            <w:tcW w:type="dxa" w:w="2736"/>
-          </w:tcPr>
-          <w:p>
-            <w:r/>
-            <w:r>
-              <w:rPr>
-                <w:sz w:val="17"/>
-              </w:rPr>
-              <w:t>Large net loss both years</w:t>
-            </w:r>
-          </w:p>
-        </w:tc>
-      </w:tr>
-      <w:tr>
-        <w:tc>
-          <w:tcPr>
-            <w:tcW w:type="dxa" w:w="2304"/>
-          </w:tcPr>
-          <w:p>
-            <w:r/>
-            <w:r>
-              <w:rPr>
-                <w:sz w:val="17"/>
-              </w:rPr>
-              <w:t>Return on assets</w:t>
-            </w:r>
-          </w:p>
-        </w:tc>
-        <w:tc>
-          <w:tcPr>
-            <w:tcW w:type="dxa" w:w="2880"/>
-          </w:tcPr>
-          <w:p>
-            <w:r/>
-            <w:r>
-              <w:rPr>
-                <w:sz w:val="17"/>
-              </w:rPr>
-              <w:t>Loss for year ÷ total assets</w:t>
-            </w:r>
-          </w:p>
-        </w:tc>
-        <w:tc>
-          <w:tcPr>
-            <w:tcW w:type="dxa" w:w="1224"/>
-          </w:tcPr>
-          <w:p>
-            <w:r/>
-            <w:r>
-              <w:rPr>
-                <w:sz w:val="17"/>
-              </w:rPr>
-              <w:t>(21.5%)</w:t>
-            </w:r>
-          </w:p>
-        </w:tc>
-        <w:tc>
-          <w:tcPr>
-            <w:tcW w:type="dxa" w:w="1224"/>
-          </w:tcPr>
-          <w:p>
-            <w:r/>
-            <w:r>
-              <w:rPr>
-                <w:sz w:val="17"/>
-              </w:rPr>
-              <w:t>(14.2%)</w:t>
-            </w:r>
-          </w:p>
-        </w:tc>
-        <w:tc>
-          <w:tcPr>
-            <w:tcW w:type="dxa" w:w="2736"/>
-          </w:tcPr>
-          <w:p>
-            <w:r/>
-            <w:r>
-              <w:rPr>
-                <w:sz w:val="17"/>
-              </w:rPr>
-              <w:t>Assets are not generating a return</w:t>
-            </w:r>
-          </w:p>
-        </w:tc>
-      </w:tr>
-    </w:tbl>
     <w:p>
       <w:pPr>
-        <w:spacing w:before="100" w:after="20"/>
+        <w:spacing w:before="40" w:after="20"/>
       </w:pPr>
       <w:r>
         <w:rPr>
           <w:b/>
-          <w:color w:val="1F3D6B"/>
-          <w:sz w:val="22"/>
+          <w:i/>
+          <w:color w:val="555555"/>
+          <w:sz w:val="18"/>
         </w:rPr>
-        <w:t>2.5 Cash and balance sheet</w:t>
-      </w:r>
-    </w:p>
-    <w:tbl>
-      <w:tblPr>
-        <w:tblStyle w:val="TableGrid"/>
-        <w:tblW w:type="auto" w:w="0"/>
-        <w:jc w:val="center"/>
-        <w:tblLook w:firstColumn="1" w:firstRow="1" w:lastColumn="0" w:lastRow="0" w:noHBand="0" w:noVBand="1" w:val="04A0"/>
-      </w:tblPr>
-      <w:tblGrid>
-        <w:gridCol w:w="2131"/>
-        <w:gridCol w:w="2131"/>
-        <w:gridCol w:w="2131"/>
-        <w:gridCol w:w="2131"/>
-        <w:gridCol w:w="2131"/>
-      </w:tblGrid>
-      <w:tr>
-        <w:tc>
-          <w:tcPr>
-            <w:tcW w:type="dxa" w:w="2160"/>
-            <w:shd w:val="clear" w:fill="1f3d6b"/>
-          </w:tcPr>
-          <w:p>
-            <w:r/>
-            <w:r>
-              <w:rPr>
-                <w:b/>
-                <w:color w:val="FFFFFF"/>
-                <w:sz w:val="17"/>
-              </w:rPr>
-              <w:t>KPI</w:t>
-            </w:r>
-          </w:p>
-        </w:tc>
-        <w:tc>
-          <w:tcPr>
-            <w:tcW w:type="dxa" w:w="2736"/>
-            <w:shd w:val="clear" w:fill="1f3d6b"/>
-          </w:tcPr>
-          <w:p>
-            <w:r/>
-            <w:r>
-              <w:rPr>
-                <w:b/>
-                <w:color w:val="FFFFFF"/>
-                <w:sz w:val="17"/>
-              </w:rPr>
-              <w:t>Formula</w:t>
-            </w:r>
-          </w:p>
-        </w:tc>
-        <w:tc>
-          <w:tcPr>
-            <w:tcW w:type="dxa" w:w="1296"/>
-            <w:shd w:val="clear" w:fill="1f3d6b"/>
-          </w:tcPr>
-          <w:p>
-            <w:r/>
-            <w:r>
-              <w:rPr>
-                <w:b/>
-                <w:color w:val="FFFFFF"/>
-                <w:sz w:val="17"/>
-              </w:rPr>
-              <w:t>2026</w:t>
-            </w:r>
-          </w:p>
-        </w:tc>
-        <w:tc>
-          <w:tcPr>
-            <w:tcW w:type="dxa" w:w="1296"/>
-            <w:shd w:val="clear" w:fill="1f3d6b"/>
-          </w:tcPr>
-          <w:p>
-            <w:r/>
-            <w:r>
-              <w:rPr>
-                <w:b/>
-                <w:color w:val="FFFFFF"/>
-                <w:sz w:val="17"/>
-              </w:rPr>
-              <w:t>2025</w:t>
-            </w:r>
-          </w:p>
-        </w:tc>
-        <w:tc>
-          <w:tcPr>
-            <w:tcW w:type="dxa" w:w="2880"/>
-            <w:shd w:val="clear" w:fill="1f3d6b"/>
-          </w:tcPr>
-          <w:p>
-            <w:r/>
-            <w:r>
-              <w:rPr>
-                <w:b/>
-                <w:color w:val="FFFFFF"/>
-                <w:sz w:val="17"/>
-              </w:rPr>
-              <w:t>Insight</w:t>
-            </w:r>
-          </w:p>
-        </w:tc>
-      </w:tr>
-      <w:tr>
-        <w:tc>
-          <w:tcPr>
-            <w:tcW w:type="dxa" w:w="2160"/>
-          </w:tcPr>
-          <w:p>
-            <w:r/>
-            <w:r>
-              <w:rPr>
-                <w:sz w:val="17"/>
-              </w:rPr>
-              <w:t>Free cash flow</w:t>
-            </w:r>
-          </w:p>
-        </w:tc>
-        <w:tc>
-          <w:tcPr>
-            <w:tcW w:type="dxa" w:w="2736"/>
-          </w:tcPr>
-          <w:p>
-            <w:r/>
-            <w:r>
-              <w:rPr>
-                <w:sz w:val="17"/>
-              </w:rPr>
-              <w:t>Operating cash flow − sustaining capex</w:t>
-            </w:r>
-          </w:p>
-        </w:tc>
-        <w:tc>
-          <w:tcPr>
-            <w:tcW w:type="dxa" w:w="1296"/>
-          </w:tcPr>
-          <w:p>
-            <w:r/>
-            <w:r>
-              <w:rPr>
-                <w:sz w:val="17"/>
-              </w:rPr>
-              <w:t>Cannot fully compute</w:t>
-            </w:r>
-          </w:p>
-        </w:tc>
-        <w:tc>
-          <w:tcPr>
-            <w:tcW w:type="dxa" w:w="1296"/>
-          </w:tcPr>
-          <w:p>
-            <w:r/>
-            <w:r>
-              <w:rPr>
-                <w:sz w:val="17"/>
-              </w:rPr>
-            </w:r>
-          </w:p>
-        </w:tc>
-        <w:tc>
-          <w:tcPr>
-            <w:tcW w:type="dxa" w:w="2880"/>
-          </w:tcPr>
-          <w:p>
-            <w:r/>
-            <w:r>
-              <w:rPr>
-                <w:sz w:val="17"/>
-              </w:rPr>
-              <w:t>A cash flow statement is needed; adjusted EBITDA of R207m is the best proxy</w:t>
-            </w:r>
-          </w:p>
-        </w:tc>
-      </w:tr>
-      <w:tr>
-        <w:tc>
-          <w:tcPr>
-            <w:tcW w:type="dxa" w:w="2160"/>
-          </w:tcPr>
-          <w:p>
-            <w:r/>
-            <w:r>
-              <w:rPr>
-                <w:sz w:val="17"/>
-              </w:rPr>
-              <w:t>Net debt</w:t>
-            </w:r>
-          </w:p>
-        </w:tc>
-        <w:tc>
-          <w:tcPr>
-            <w:tcW w:type="dxa" w:w="2736"/>
-          </w:tcPr>
-          <w:p>
-            <w:r/>
-            <w:r>
-              <w:rPr>
-                <w:sz w:val="17"/>
-              </w:rPr>
-              <w:t>Borrowings − cash</w:t>
-            </w:r>
-          </w:p>
-        </w:tc>
-        <w:tc>
-          <w:tcPr>
-            <w:tcW w:type="dxa" w:w="1296"/>
-          </w:tcPr>
-          <w:p>
-            <w:r/>
-            <w:r>
-              <w:rPr>
-                <w:sz w:val="17"/>
-              </w:rPr>
-              <w:t>2 592</w:t>
-            </w:r>
-          </w:p>
-        </w:tc>
-        <w:tc>
-          <w:tcPr>
-            <w:tcW w:type="dxa" w:w="1296"/>
-          </w:tcPr>
-          <w:p>
-            <w:r/>
-            <w:r>
-              <w:rPr>
-                <w:sz w:val="17"/>
-              </w:rPr>
-              <w:t>2 178</w:t>
-            </w:r>
-          </w:p>
-        </w:tc>
-        <w:tc>
-          <w:tcPr>
-            <w:tcW w:type="dxa" w:w="2880"/>
-          </w:tcPr>
-          <w:p>
-            <w:r/>
-            <w:r>
-              <w:rPr>
-                <w:sz w:val="17"/>
-              </w:rPr>
-              <w:t>Rising net debt against falling earnings</w:t>
-            </w:r>
-          </w:p>
-        </w:tc>
-      </w:tr>
-      <w:tr>
-        <w:tc>
-          <w:tcPr>
-            <w:tcW w:type="dxa" w:w="2160"/>
-          </w:tcPr>
-          <w:p>
-            <w:r/>
-            <w:r>
-              <w:rPr>
-                <w:sz w:val="17"/>
-              </w:rPr>
-              <w:t>Net debt : EBITDA</w:t>
-            </w:r>
-          </w:p>
-        </w:tc>
-        <w:tc>
-          <w:tcPr>
-            <w:tcW w:type="dxa" w:w="2736"/>
-          </w:tcPr>
-          <w:p>
-            <w:r/>
-            <w:r>
-              <w:rPr>
-                <w:sz w:val="17"/>
-              </w:rPr>
-              <w:t>Net debt ÷ adjusted EBITDA</w:t>
-            </w:r>
-          </w:p>
-        </w:tc>
-        <w:tc>
-          <w:tcPr>
-            <w:tcW w:type="dxa" w:w="1296"/>
-          </w:tcPr>
-          <w:p>
-            <w:r/>
-            <w:r>
-              <w:rPr>
-                <w:sz w:val="17"/>
-              </w:rPr>
-              <w:t>12.5x</w:t>
-            </w:r>
-          </w:p>
-        </w:tc>
-        <w:tc>
-          <w:tcPr>
-            <w:tcW w:type="dxa" w:w="1296"/>
-          </w:tcPr>
-          <w:p>
-            <w:r/>
-            <w:r>
-              <w:rPr>
-                <w:sz w:val="17"/>
-              </w:rPr>
-              <w:t>4.0x</w:t>
-            </w:r>
-          </w:p>
-        </w:tc>
-        <w:tc>
-          <w:tcPr>
-            <w:tcW w:type="dxa" w:w="2880"/>
-          </w:tcPr>
-          <w:p>
-            <w:r/>
-            <w:r>
-              <w:rPr>
-                <w:sz w:val="17"/>
-              </w:rPr>
-              <w:t>Extremely stretched; a clear distress signal</w:t>
-            </w:r>
-          </w:p>
-        </w:tc>
-      </w:tr>
-      <w:tr>
-        <w:tc>
-          <w:tcPr>
-            <w:tcW w:type="dxa" w:w="2160"/>
-          </w:tcPr>
-          <w:p>
-            <w:r/>
-            <w:r>
-              <w:rPr>
-                <w:sz w:val="17"/>
-              </w:rPr>
-              <w:t>Gearing</w:t>
-            </w:r>
-          </w:p>
-        </w:tc>
-        <w:tc>
-          <w:tcPr>
-            <w:tcW w:type="dxa" w:w="2736"/>
-          </w:tcPr>
-          <w:p>
-            <w:r/>
-            <w:r>
-              <w:rPr>
-                <w:sz w:val="17"/>
-              </w:rPr>
-              <w:t>Net debt ÷ equity</w:t>
-            </w:r>
-          </w:p>
-        </w:tc>
-        <w:tc>
-          <w:tcPr>
-            <w:tcW w:type="dxa" w:w="1296"/>
-          </w:tcPr>
-          <w:p>
-            <w:r/>
-            <w:r>
-              <w:rPr>
-                <w:sz w:val="17"/>
-              </w:rPr>
-              <w:t>291%</w:t>
-            </w:r>
-          </w:p>
-        </w:tc>
-        <w:tc>
-          <w:tcPr>
-            <w:tcW w:type="dxa" w:w="1296"/>
-          </w:tcPr>
-          <w:p>
-            <w:r/>
-            <w:r>
-              <w:rPr>
-                <w:sz w:val="17"/>
-              </w:rPr>
-              <w:t>114%</w:t>
-            </w:r>
-          </w:p>
-        </w:tc>
-        <w:tc>
-          <w:tcPr>
-            <w:tcW w:type="dxa" w:w="2880"/>
-          </w:tcPr>
-          <w:p>
-            <w:r/>
-            <w:r>
-              <w:rPr>
-                <w:sz w:val="17"/>
-              </w:rPr>
-              <w:t>Gearing has almost tripled as equity halved</w:t>
-            </w:r>
-          </w:p>
-        </w:tc>
-      </w:tr>
-      <w:tr>
-        <w:tc>
-          <w:tcPr>
-            <w:tcW w:type="dxa" w:w="2160"/>
-          </w:tcPr>
-          <w:p>
-            <w:r/>
-            <w:r>
-              <w:rPr>
-                <w:sz w:val="17"/>
-              </w:rPr>
-              <w:t>Interest cover</w:t>
-            </w:r>
-          </w:p>
-        </w:tc>
-        <w:tc>
-          <w:tcPr>
-            <w:tcW w:type="dxa" w:w="2736"/>
-          </w:tcPr>
-          <w:p>
-            <w:r/>
-            <w:r>
-              <w:rPr>
-                <w:sz w:val="17"/>
-              </w:rPr>
-              <w:t>Operating profit ÷ finance cost</w:t>
-            </w:r>
-          </w:p>
-        </w:tc>
-        <w:tc>
-          <w:tcPr>
-            <w:tcW w:type="dxa" w:w="1296"/>
-          </w:tcPr>
-          <w:p>
-            <w:r/>
-            <w:r>
-              <w:rPr>
-                <w:sz w:val="17"/>
-              </w:rPr>
-              <w:t>None</w:t>
-            </w:r>
-          </w:p>
-        </w:tc>
-        <w:tc>
-          <w:tcPr>
-            <w:tcW w:type="dxa" w:w="1296"/>
-          </w:tcPr>
-          <w:p>
-            <w:r/>
-            <w:r>
-              <w:rPr>
-                <w:sz w:val="17"/>
-              </w:rPr>
-              <w:t>None</w:t>
-            </w:r>
-          </w:p>
-        </w:tc>
-        <w:tc>
-          <w:tcPr>
-            <w:tcW w:type="dxa" w:w="2880"/>
-          </w:tcPr>
-          <w:p>
-            <w:r/>
-            <w:r>
-              <w:rPr>
-                <w:sz w:val="17"/>
-              </w:rPr>
-              <w:t>Operations make a loss, so interest is not covered</w:t>
-            </w:r>
-          </w:p>
-        </w:tc>
-      </w:tr>
-      <w:tr>
-        <w:tc>
-          <w:tcPr>
-            <w:tcW w:type="dxa" w:w="2160"/>
-          </w:tcPr>
-          <w:p>
-            <w:r/>
-            <w:r>
-              <w:rPr>
-                <w:sz w:val="17"/>
-              </w:rPr>
-              <w:t>Current ratio</w:t>
-            </w:r>
-          </w:p>
-        </w:tc>
-        <w:tc>
-          <w:tcPr>
-            <w:tcW w:type="dxa" w:w="2736"/>
-          </w:tcPr>
-          <w:p>
-            <w:r/>
-            <w:r>
-              <w:rPr>
-                <w:sz w:val="17"/>
-              </w:rPr>
-              <w:t>Current assets ÷ current liabilities</w:t>
-            </w:r>
-          </w:p>
-        </w:tc>
-        <w:tc>
-          <w:tcPr>
-            <w:tcW w:type="dxa" w:w="1296"/>
-          </w:tcPr>
-          <w:p>
-            <w:r/>
-            <w:r>
-              <w:rPr>
-                <w:sz w:val="17"/>
-              </w:rPr>
-              <w:t>0.30</w:t>
-            </w:r>
-          </w:p>
-        </w:tc>
-        <w:tc>
-          <w:tcPr>
-            <w:tcW w:type="dxa" w:w="1296"/>
-          </w:tcPr>
-          <w:p>
-            <w:r/>
-            <w:r>
-              <w:rPr>
-                <w:sz w:val="17"/>
-              </w:rPr>
-              <w:t>1.12</w:t>
-            </w:r>
-          </w:p>
-        </w:tc>
-        <w:tc>
-          <w:tcPr>
-            <w:tcW w:type="dxa" w:w="2880"/>
-          </w:tcPr>
-          <w:p>
-            <w:r/>
-            <w:r>
-              <w:rPr>
-                <w:sz w:val="17"/>
-              </w:rPr>
-              <w:t>Liquidity collapsed as loans were reclassified to current</w:t>
-            </w:r>
-          </w:p>
-        </w:tc>
-      </w:tr>
-    </w:tbl>
-    <w:p>
-      <w:pPr>
-        <w:spacing w:before="100" w:after="20"/>
-      </w:pPr>
-      <w:r>
-        <w:rPr>
-          <w:b/>
-          <w:color w:val="1F3D6B"/>
-          <w:sz w:val="22"/>
-        </w:rPr>
-        <w:t>2.6 Working capital</w:t>
+        <w:t>Formula and inputs</w:t>
       </w:r>
     </w:p>
     <w:tbl>
@@ -2557,8 +2356,8 @@
       <w:tr>
         <w:tc>
           <w:tcPr>
-            <w:tcW w:type="dxa" w:w="2448"/>
-            <w:shd w:val="clear" w:fill="1f3d6b"/>
+            <w:tcW w:type="dxa" w:w="2160"/>
+            <w:shd w:val="clear" w:fill="4a5a72"/>
           </w:tcPr>
           <w:p>
             <w:r/>
@@ -2574,8 +2373,8 @@
         </w:tc>
         <w:tc>
           <w:tcPr>
-            <w:tcW w:type="dxa" w:w="1440"/>
-            <w:shd w:val="clear" w:fill="1f3d6b"/>
+            <w:tcW w:type="dxa" w:w="3024"/>
+            <w:shd w:val="clear" w:fill="4a5a72"/>
           </w:tcPr>
           <w:p>
             <w:r/>
@@ -2585,14 +2384,14 @@
                 <w:color w:val="FFFFFF"/>
                 <w:sz w:val="17"/>
               </w:rPr>
-              <w:t>2026</w:t>
+              <w:t>Formula</w:t>
             </w:r>
           </w:p>
         </w:tc>
         <w:tc>
           <w:tcPr>
-            <w:tcW w:type="dxa" w:w="1440"/>
-            <w:shd w:val="clear" w:fill="1f3d6b"/>
+            <w:tcW w:type="dxa" w:w="2592"/>
+            <w:shd w:val="clear" w:fill="4a5a72"/>
           </w:tcPr>
           <w:p>
             <w:r/>
@@ -2602,14 +2401,14 @@
                 <w:color w:val="FFFFFF"/>
                 <w:sz w:val="17"/>
               </w:rPr>
-              <w:t>2025</w:t>
+              <w:t>2026: inputs → result</w:t>
             </w:r>
           </w:p>
         </w:tc>
         <w:tc>
           <w:tcPr>
-            <w:tcW w:type="dxa" w:w="5040"/>
-            <w:shd w:val="clear" w:fill="1f3d6b"/>
+            <w:tcW w:type="dxa" w:w="2592"/>
+            <w:shd w:val="clear" w:fill="4a5a72"/>
           </w:tcPr>
           <w:p>
             <w:r/>
@@ -2619,7 +2418,7 @@
                 <w:color w:val="FFFFFF"/>
                 <w:sz w:val="17"/>
               </w:rPr>
-              <w:t>Insight</w:t>
+              <w:t>2025: inputs → result</w:t>
             </w:r>
           </w:p>
         </w:tc>
@@ -2627,7 +2426,491 @@
       <w:tr>
         <w:tc>
           <w:tcPr>
-            <w:tcW w:type="dxa" w:w="2448"/>
+            <w:tcW w:type="dxa" w:w="2160"/>
+            <w:shd w:val="clear" w:fill="f4f6fa"/>
+          </w:tcPr>
+          <w:p>
+            <w:r/>
+            <w:r>
+              <w:rPr>
+                <w:sz w:val="17"/>
+              </w:rPr>
+              <w:t>Net debt</w:t>
+            </w:r>
+          </w:p>
+        </w:tc>
+        <w:tc>
+          <w:tcPr>
+            <w:tcW w:type="dxa" w:w="3024"/>
+            <w:shd w:val="clear" w:fill="f4f6fa"/>
+          </w:tcPr>
+          <w:p>
+            <w:r/>
+            <w:r>
+              <w:rPr>
+                <w:sz w:val="17"/>
+              </w:rPr>
+              <w:t>Borrowings − cash</w:t>
+            </w:r>
+          </w:p>
+        </w:tc>
+        <w:tc>
+          <w:tcPr>
+            <w:tcW w:type="dxa" w:w="2592"/>
+            <w:shd w:val="clear" w:fill="f4f6fa"/>
+          </w:tcPr>
+          <w:p>
+            <w:r/>
+            <w:r>
+              <w:rPr>
+                <w:sz w:val="17"/>
+              </w:rPr>
+              <w:t>2 925 − 333 = 2 592</w:t>
+            </w:r>
+          </w:p>
+        </w:tc>
+        <w:tc>
+          <w:tcPr>
+            <w:tcW w:type="dxa" w:w="2592"/>
+            <w:shd w:val="clear" w:fill="f4f6fa"/>
+          </w:tcPr>
+          <w:p>
+            <w:r/>
+            <w:r>
+              <w:rPr>
+                <w:sz w:val="17"/>
+              </w:rPr>
+              <w:t>2 439 − 261 = 2 178</w:t>
+            </w:r>
+          </w:p>
+        </w:tc>
+      </w:tr>
+      <w:tr>
+        <w:tc>
+          <w:tcPr>
+            <w:tcW w:type="dxa" w:w="2160"/>
+            <w:shd w:val="clear" w:fill="f4f6fa"/>
+          </w:tcPr>
+          <w:p>
+            <w:r/>
+            <w:r>
+              <w:rPr>
+                <w:sz w:val="17"/>
+              </w:rPr>
+              <w:t>Net debt : EBITDA</w:t>
+            </w:r>
+          </w:p>
+        </w:tc>
+        <w:tc>
+          <w:tcPr>
+            <w:tcW w:type="dxa" w:w="3024"/>
+            <w:shd w:val="clear" w:fill="f4f6fa"/>
+          </w:tcPr>
+          <w:p>
+            <w:r/>
+            <w:r>
+              <w:rPr>
+                <w:sz w:val="17"/>
+              </w:rPr>
+              <w:t>Net debt ÷ adjusted EBITDA</w:t>
+            </w:r>
+          </w:p>
+        </w:tc>
+        <w:tc>
+          <w:tcPr>
+            <w:tcW w:type="dxa" w:w="2592"/>
+            <w:shd w:val="clear" w:fill="f4f6fa"/>
+          </w:tcPr>
+          <w:p>
+            <w:r/>
+            <w:r>
+              <w:rPr>
+                <w:sz w:val="17"/>
+              </w:rPr>
+              <w:t>2 592 ÷ 207 = 12.5x</w:t>
+            </w:r>
+          </w:p>
+        </w:tc>
+        <w:tc>
+          <w:tcPr>
+            <w:tcW w:type="dxa" w:w="2592"/>
+            <w:shd w:val="clear" w:fill="f4f6fa"/>
+          </w:tcPr>
+          <w:p>
+            <w:r/>
+            <w:r>
+              <w:rPr>
+                <w:sz w:val="17"/>
+              </w:rPr>
+              <w:t>2 178 ÷ 540 = 4.0x</w:t>
+            </w:r>
+          </w:p>
+        </w:tc>
+      </w:tr>
+      <w:tr>
+        <w:tc>
+          <w:tcPr>
+            <w:tcW w:type="dxa" w:w="2160"/>
+            <w:shd w:val="clear" w:fill="f4f6fa"/>
+          </w:tcPr>
+          <w:p>
+            <w:r/>
+            <w:r>
+              <w:rPr>
+                <w:sz w:val="17"/>
+              </w:rPr>
+              <w:t>Gearing</w:t>
+            </w:r>
+          </w:p>
+        </w:tc>
+        <w:tc>
+          <w:tcPr>
+            <w:tcW w:type="dxa" w:w="3024"/>
+            <w:shd w:val="clear" w:fill="f4f6fa"/>
+          </w:tcPr>
+          <w:p>
+            <w:r/>
+            <w:r>
+              <w:rPr>
+                <w:sz w:val="17"/>
+              </w:rPr>
+              <w:t>Net debt ÷ equity</w:t>
+            </w:r>
+          </w:p>
+        </w:tc>
+        <w:tc>
+          <w:tcPr>
+            <w:tcW w:type="dxa" w:w="2592"/>
+            <w:shd w:val="clear" w:fill="f4f6fa"/>
+          </w:tcPr>
+          <w:p>
+            <w:r/>
+            <w:r>
+              <w:rPr>
+                <w:sz w:val="17"/>
+              </w:rPr>
+              <w:t>2 592 ÷ 891 = 291%</w:t>
+            </w:r>
+          </w:p>
+        </w:tc>
+        <w:tc>
+          <w:tcPr>
+            <w:tcW w:type="dxa" w:w="2592"/>
+            <w:shd w:val="clear" w:fill="f4f6fa"/>
+          </w:tcPr>
+          <w:p>
+            <w:r/>
+            <w:r>
+              <w:rPr>
+                <w:sz w:val="17"/>
+              </w:rPr>
+              <w:t>2 178 ÷ 1 917 = 114%</w:t>
+            </w:r>
+          </w:p>
+        </w:tc>
+      </w:tr>
+      <w:tr>
+        <w:tc>
+          <w:tcPr>
+            <w:tcW w:type="dxa" w:w="2160"/>
+            <w:shd w:val="clear" w:fill="f4f6fa"/>
+          </w:tcPr>
+          <w:p>
+            <w:r/>
+            <w:r>
+              <w:rPr>
+                <w:sz w:val="17"/>
+              </w:rPr>
+              <w:t>Current ratio</w:t>
+            </w:r>
+          </w:p>
+        </w:tc>
+        <w:tc>
+          <w:tcPr>
+            <w:tcW w:type="dxa" w:w="3024"/>
+            <w:shd w:val="clear" w:fill="f4f6fa"/>
+          </w:tcPr>
+          <w:p>
+            <w:r/>
+            <w:r>
+              <w:rPr>
+                <w:sz w:val="17"/>
+              </w:rPr>
+              <w:t>Current assets ÷ current liabilities</w:t>
+            </w:r>
+          </w:p>
+        </w:tc>
+        <w:tc>
+          <w:tcPr>
+            <w:tcW w:type="dxa" w:w="2592"/>
+            <w:shd w:val="clear" w:fill="f4f6fa"/>
+          </w:tcPr>
+          <w:p>
+            <w:r/>
+            <w:r>
+              <w:rPr>
+                <w:sz w:val="17"/>
+              </w:rPr>
+              <w:t>1 017 ÷ 3 357 = 0.30</w:t>
+            </w:r>
+          </w:p>
+        </w:tc>
+        <w:tc>
+          <w:tcPr>
+            <w:tcW w:type="dxa" w:w="2592"/>
+            <w:shd w:val="clear" w:fill="f4f6fa"/>
+          </w:tcPr>
+          <w:p>
+            <w:r/>
+            <w:r>
+              <w:rPr>
+                <w:sz w:val="17"/>
+              </w:rPr>
+              <w:t>1 350 ÷ 1 206 = 1.12</w:t>
+            </w:r>
+          </w:p>
+        </w:tc>
+      </w:tr>
+      <w:tr>
+        <w:tc>
+          <w:tcPr>
+            <w:tcW w:type="dxa" w:w="2160"/>
+            <w:shd w:val="clear" w:fill="f4f6fa"/>
+          </w:tcPr>
+          <w:p>
+            <w:r/>
+            <w:r>
+              <w:rPr>
+                <w:sz w:val="17"/>
+              </w:rPr>
+              <w:t>Interest cover</w:t>
+            </w:r>
+          </w:p>
+        </w:tc>
+        <w:tc>
+          <w:tcPr>
+            <w:tcW w:type="dxa" w:w="3024"/>
+            <w:shd w:val="clear" w:fill="f4f6fa"/>
+          </w:tcPr>
+          <w:p>
+            <w:r/>
+            <w:r>
+              <w:rPr>
+                <w:sz w:val="17"/>
+              </w:rPr>
+              <w:t>Operating profit ÷ finance expense</w:t>
+            </w:r>
+          </w:p>
+        </w:tc>
+        <w:tc>
+          <w:tcPr>
+            <w:tcW w:type="dxa" w:w="2592"/>
+            <w:shd w:val="clear" w:fill="f4f6fa"/>
+          </w:tcPr>
+          <w:p>
+            <w:r/>
+            <w:r>
+              <w:rPr>
+                <w:sz w:val="17"/>
+              </w:rPr>
+              <w:t>Operating loss ÷ 378 = none</w:t>
+            </w:r>
+          </w:p>
+        </w:tc>
+        <w:tc>
+          <w:tcPr>
+            <w:tcW w:type="dxa" w:w="2592"/>
+            <w:shd w:val="clear" w:fill="f4f6fa"/>
+          </w:tcPr>
+          <w:p>
+            <w:r/>
+            <w:r>
+              <w:rPr>
+                <w:sz w:val="17"/>
+              </w:rPr>
+              <w:t>Operating loss ÷ 360 = none</w:t>
+            </w:r>
+          </w:p>
+        </w:tc>
+      </w:tr>
+    </w:tbl>
+    <w:p>
+      <w:pPr>
+        <w:spacing w:before="40" w:after="20"/>
+      </w:pPr>
+      <w:r>
+        <w:rPr>
+          <w:b/>
+          <w:i/>
+          <w:color w:val="555555"/>
+          <w:sz w:val="18"/>
+        </w:rPr>
+        <w:t>Analysis</w:t>
+      </w:r>
+    </w:p>
+    <w:p>
+      <w:pPr>
+        <w:pStyle w:val="ListBullet"/>
+        <w:spacing w:after="60"/>
+      </w:pPr>
+      <w:r>
+        <w:rPr>
+          <w:sz w:val="20"/>
+        </w:rPr>
+        <w:t>Net debt of R2 592m against adjusted EBITDA of R207m gives a ratio of 12.5x, which is an extreme distress signal.</w:t>
+      </w:r>
+    </w:p>
+    <w:p>
+      <w:pPr>
+        <w:pStyle w:val="ListBullet"/>
+        <w:spacing w:after="60"/>
+      </w:pPr>
+      <w:r>
+        <w:rPr>
+          <w:sz w:val="20"/>
+        </w:rPr>
+        <w:t>Gearing has almost tripled to 291%, because the R1 044m loss nearly halved equity while net debt rose.</w:t>
+      </w:r>
+    </w:p>
+    <w:p>
+      <w:pPr>
+        <w:pStyle w:val="ListBullet"/>
+        <w:spacing w:after="60"/>
+      </w:pPr>
+      <w:r>
+        <w:rPr>
+          <w:sz w:val="20"/>
+        </w:rPr>
+        <w:t>The current ratio collapsed to 0.30, mainly because R2 925m of loans were reclassified to current, which is the going-concern trigger.</w:t>
+      </w:r>
+    </w:p>
+    <w:p>
+      <w:pPr>
+        <w:pStyle w:val="ListBullet"/>
+        <w:spacing w:after="60"/>
+      </w:pPr>
+      <w:r>
+        <w:rPr>
+          <w:sz w:val="20"/>
+        </w:rPr>
+        <w:t>There is no interest cover, because operations made a loss, so finance costs are met from cash and refinancing rather than earnings.</w:t>
+      </w:r>
+    </w:p>
+    <w:p>
+      <w:pPr>
+        <w:spacing w:before="120" w:after="20"/>
+      </w:pPr>
+      <w:r>
+        <w:rPr>
+          <w:b/>
+          <w:color w:val="1F3D6B"/>
+          <w:sz w:val="22"/>
+        </w:rPr>
+        <w:t>2.4 Working capital</w:t>
+      </w:r>
+    </w:p>
+    <w:p>
+      <w:pPr>
+        <w:spacing w:before="40" w:after="20"/>
+      </w:pPr>
+      <w:r>
+        <w:rPr>
+          <w:b/>
+          <w:i/>
+          <w:color w:val="555555"/>
+          <w:sz w:val="18"/>
+        </w:rPr>
+        <w:t>Formula and inputs</w:t>
+      </w:r>
+    </w:p>
+    <w:tbl>
+      <w:tblPr>
+        <w:tblStyle w:val="TableGrid"/>
+        <w:tblW w:type="auto" w:w="0"/>
+        <w:jc w:val="center"/>
+        <w:tblLook w:firstColumn="1" w:firstRow="1" w:lastColumn="0" w:lastRow="0" w:noHBand="0" w:noVBand="1" w:val="04A0"/>
+      </w:tblPr>
+      <w:tblGrid>
+        <w:gridCol w:w="2664"/>
+        <w:gridCol w:w="2664"/>
+        <w:gridCol w:w="2664"/>
+        <w:gridCol w:w="2664"/>
+      </w:tblGrid>
+      <w:tr>
+        <w:tc>
+          <w:tcPr>
+            <w:tcW w:type="dxa" w:w="2160"/>
+            <w:shd w:val="clear" w:fill="4a5a72"/>
+          </w:tcPr>
+          <w:p>
+            <w:r/>
+            <w:r>
+              <w:rPr>
+                <w:b/>
+                <w:color w:val="FFFFFF"/>
+                <w:sz w:val="17"/>
+              </w:rPr>
+              <w:t>KPI</w:t>
+            </w:r>
+          </w:p>
+        </w:tc>
+        <w:tc>
+          <w:tcPr>
+            <w:tcW w:type="dxa" w:w="3024"/>
+            <w:shd w:val="clear" w:fill="4a5a72"/>
+          </w:tcPr>
+          <w:p>
+            <w:r/>
+            <w:r>
+              <w:rPr>
+                <w:b/>
+                <w:color w:val="FFFFFF"/>
+                <w:sz w:val="17"/>
+              </w:rPr>
+              <w:t>Formula</w:t>
+            </w:r>
+          </w:p>
+        </w:tc>
+        <w:tc>
+          <w:tcPr>
+            <w:tcW w:type="dxa" w:w="2592"/>
+            <w:shd w:val="clear" w:fill="4a5a72"/>
+          </w:tcPr>
+          <w:p>
+            <w:r/>
+            <w:r>
+              <w:rPr>
+                <w:b/>
+                <w:color w:val="FFFFFF"/>
+                <w:sz w:val="17"/>
+              </w:rPr>
+              <w:t>2026: inputs → result</w:t>
+            </w:r>
+          </w:p>
+        </w:tc>
+        <w:tc>
+          <w:tcPr>
+            <w:tcW w:type="dxa" w:w="2592"/>
+            <w:shd w:val="clear" w:fill="4a5a72"/>
+          </w:tcPr>
+          <w:p>
+            <w:r/>
+            <w:r>
+              <w:rPr>
+                <w:b/>
+                <w:color w:val="FFFFFF"/>
+                <w:sz w:val="17"/>
+              </w:rPr>
+              <w:t>2025: inputs → result</w:t>
+            </w:r>
+          </w:p>
+        </w:tc>
+      </w:tr>
+      <w:tr>
+        <w:tc>
+          <w:tcPr>
+            <w:tcW w:type="dxa" w:w="2160"/>
+            <w:shd w:val="clear" w:fill="f4f6fa"/>
           </w:tcPr>
           <w:p>
             <w:r/>
@@ -2641,7 +2924,8 @@
         </w:tc>
         <w:tc>
           <w:tcPr>
-            <w:tcW w:type="dxa" w:w="1440"/>
+            <w:tcW w:type="dxa" w:w="3024"/>
+            <w:shd w:val="clear" w:fill="f4f6fa"/>
           </w:tcPr>
           <w:p>
             <w:r/>
@@ -2649,13 +2933,14 @@
               <w:rPr>
                 <w:sz w:val="17"/>
               </w:rPr>
-              <w:t>~50</w:t>
+              <w:t>Inventory ÷ mining costs × 365</w:t>
             </w:r>
           </w:p>
         </w:tc>
         <w:tc>
           <w:tcPr>
-            <w:tcW w:type="dxa" w:w="1440"/>
+            <w:tcW w:type="dxa" w:w="2592"/>
+            <w:shd w:val="clear" w:fill="f4f6fa"/>
           </w:tcPr>
           <w:p>
             <w:r/>
@@ -2663,13 +2948,14 @@
               <w:rPr>
                 <w:sz w:val="17"/>
               </w:rPr>
-              <w:t>~59</w:t>
+              <w:t>315 ÷ 2 295 × 365 = 50 days</w:t>
             </w:r>
           </w:p>
         </w:tc>
         <w:tc>
           <w:tcPr>
-            <w:tcW w:type="dxa" w:w="5040"/>
+            <w:tcW w:type="dxa" w:w="2592"/>
+            <w:shd w:val="clear" w:fill="f4f6fa"/>
           </w:tcPr>
           <w:p>
             <w:r/>
@@ -2677,7 +2963,7 @@
               <w:rPr>
                 <w:sz w:val="17"/>
               </w:rPr>
-              <w:t>Inventory reduced; watch for forced low-price sales</w:t>
+              <w:t>459 ÷ 2 817 × 365 = 59 days</w:t>
             </w:r>
           </w:p>
         </w:tc>
@@ -2685,7 +2971,8 @@
       <w:tr>
         <w:tc>
           <w:tcPr>
-            <w:tcW w:type="dxa" w:w="2448"/>
+            <w:tcW w:type="dxa" w:w="2160"/>
+            <w:shd w:val="clear" w:fill="f4f6fa"/>
           </w:tcPr>
           <w:p>
             <w:r/>
@@ -2699,7 +2986,8 @@
         </w:tc>
         <w:tc>
           <w:tcPr>
-            <w:tcW w:type="dxa" w:w="1440"/>
+            <w:tcW w:type="dxa" w:w="3024"/>
+            <w:shd w:val="clear" w:fill="f4f6fa"/>
           </w:tcPr>
           <w:p>
             <w:r/>
@@ -2707,13 +2995,14 @@
               <w:rPr>
                 <w:sz w:val="17"/>
               </w:rPr>
-              <w:t>~39</w:t>
+              <w:t>Receivables ÷ revenue × 365</w:t>
             </w:r>
           </w:p>
         </w:tc>
         <w:tc>
           <w:tcPr>
-            <w:tcW w:type="dxa" w:w="1440"/>
+            <w:tcW w:type="dxa" w:w="2592"/>
+            <w:shd w:val="clear" w:fill="f4f6fa"/>
           </w:tcPr>
           <w:p>
             <w:r/>
@@ -2721,13 +3010,14 @@
               <w:rPr>
                 <w:sz w:val="17"/>
               </w:rPr>
-              <w:t>~62</w:t>
+              <w:t>198 ÷ 1 863 × 365 = 39 days</w:t>
             </w:r>
           </w:p>
         </w:tc>
         <w:tc>
           <w:tcPr>
-            <w:tcW w:type="dxa" w:w="5040"/>
+            <w:tcW w:type="dxa" w:w="2592"/>
+            <w:shd w:val="clear" w:fill="f4f6fa"/>
           </w:tcPr>
           <w:p>
             <w:r/>
@@ -2735,7 +3025,7 @@
               <w:rPr>
                 <w:sz w:val="17"/>
               </w:rPr>
-              <w:t>Improved, but partly because revenue is lower and tenders settle on award</w:t>
+              <w:t>477 ÷ 2 790 × 365 = 62 days</w:t>
             </w:r>
           </w:p>
         </w:tc>
@@ -2743,7 +3033,8 @@
       <w:tr>
         <w:tc>
           <w:tcPr>
-            <w:tcW w:type="dxa" w:w="2448"/>
+            <w:tcW w:type="dxa" w:w="2160"/>
+            <w:shd w:val="clear" w:fill="f4f6fa"/>
           </w:tcPr>
           <w:p>
             <w:r/>
@@ -2757,7 +3048,8 @@
         </w:tc>
         <w:tc>
           <w:tcPr>
-            <w:tcW w:type="dxa" w:w="1440"/>
+            <w:tcW w:type="dxa" w:w="3024"/>
+            <w:shd w:val="clear" w:fill="f4f6fa"/>
           </w:tcPr>
           <w:p>
             <w:r/>
@@ -2765,13 +3057,14 @@
               <w:rPr>
                 <w:sz w:val="17"/>
               </w:rPr>
-              <w:t>~47</w:t>
+              <w:t>Payables ÷ mining costs × 365</w:t>
             </w:r>
           </w:p>
         </w:tc>
         <w:tc>
           <w:tcPr>
-            <w:tcW w:type="dxa" w:w="1440"/>
+            <w:tcW w:type="dxa" w:w="2592"/>
+            <w:shd w:val="clear" w:fill="f4f6fa"/>
           </w:tcPr>
           <w:p>
             <w:r/>
@@ -2779,13 +3072,14 @@
               <w:rPr>
                 <w:sz w:val="17"/>
               </w:rPr>
-              <w:t>~91</w:t>
+              <w:t>297 ÷ 2 295 × 365 = 47 days</w:t>
             </w:r>
           </w:p>
         </w:tc>
         <w:tc>
           <w:tcPr>
-            <w:tcW w:type="dxa" w:w="5040"/>
+            <w:tcW w:type="dxa" w:w="2592"/>
+            <w:shd w:val="clear" w:fill="f4f6fa"/>
           </w:tcPr>
           <w:p>
             <w:r/>
@@ -2793,7 +3087,7 @@
               <w:rPr>
                 <w:sz w:val="17"/>
               </w:rPr>
-              <w:t>Paying suppliers much faster while cash is scarce, a further cash drain</w:t>
+              <w:t>702 ÷ 2 817 × 365 = 91 days</w:t>
             </w:r>
           </w:p>
         </w:tc>
@@ -2801,7 +3095,57 @@
     </w:tbl>
     <w:p>
       <w:pPr>
-        <w:spacing w:before="100" w:after="20"/>
+        <w:spacing w:before="40" w:after="20"/>
+      </w:pPr>
+      <w:r>
+        <w:rPr>
+          <w:b/>
+          <w:i/>
+          <w:color w:val="555555"/>
+          <w:sz w:val="18"/>
+        </w:rPr>
+        <w:t>Analysis</w:t>
+      </w:r>
+    </w:p>
+    <w:p>
+      <w:pPr>
+        <w:pStyle w:val="ListBullet"/>
+        <w:spacing w:after="60"/>
+      </w:pPr>
+      <w:r>
+        <w:rPr>
+          <w:sz w:val="20"/>
+        </w:rPr>
+        <w:t>Inventory days fell from 59 to 50, which frees cash but risks selling diamonds into a weak market against the strategy.</w:t>
+      </w:r>
+    </w:p>
+    <w:p>
+      <w:pPr>
+        <w:pStyle w:val="ListBullet"/>
+        <w:spacing w:after="60"/>
+      </w:pPr>
+      <w:r>
+        <w:rPr>
+          <w:sz w:val="20"/>
+        </w:rPr>
+        <w:t>Receivables days improved from 62 to 39, but partly because revenue is lower and tender sales settle on award.</w:t>
+      </w:r>
+    </w:p>
+    <w:p>
+      <w:pPr>
+        <w:pStyle w:val="ListBullet"/>
+        <w:spacing w:after="60"/>
+      </w:pPr>
+      <w:r>
+        <w:rPr>
+          <w:sz w:val="20"/>
+        </w:rPr>
+        <w:t>Payables days almost halved from 91 to 47, meaning suppliers are being paid much faster while cash is scarce, which is a further drain.</w:t>
+      </w:r>
+    </w:p>
+    <w:p>
+      <w:pPr>
+        <w:spacing w:before="120" w:after="20"/>
       </w:pPr>
       <w:r>
         <w:rPr>
@@ -2809,7 +3153,7 @@
           <w:color w:val="1F3D6B"/>
           <w:sz w:val="22"/>
         </w:rPr>
-        <w:t>2.7 Safety</w:t>
+        <w:t>2.5 Measures that cannot be calculated from the pre-release</w:t>
       </w:r>
     </w:p>
     <w:tbl>
@@ -2827,7 +3171,7 @@
       <w:tr>
         <w:tc>
           <w:tcPr>
-            <w:tcW w:type="dxa" w:w="2304"/>
+            <w:tcW w:type="dxa" w:w="3024"/>
             <w:shd w:val="clear" w:fill="1f3d6b"/>
           </w:tcPr>
           <w:p>
@@ -2838,13 +3182,13 @@
                 <w:color w:val="FFFFFF"/>
                 <w:sz w:val="17"/>
               </w:rPr>
-              <w:t>KPI</w:t>
+              <w:t>KPI (industry standard)</w:t>
             </w:r>
           </w:p>
         </w:tc>
         <w:tc>
           <w:tcPr>
-            <w:tcW w:type="dxa" w:w="2448"/>
+            <w:tcW w:type="dxa" w:w="3168"/>
             <w:shd w:val="clear" w:fill="1f3d6b"/>
           </w:tcPr>
           <w:p>
@@ -2855,13 +3199,13 @@
                 <w:color w:val="FFFFFF"/>
                 <w:sz w:val="17"/>
               </w:rPr>
-              <w:t>Diamante</w:t>
+              <w:t>Formula</w:t>
             </w:r>
           </w:p>
         </w:tc>
         <w:tc>
           <w:tcPr>
-            <w:tcW w:type="dxa" w:w="5616"/>
+            <w:tcW w:type="dxa" w:w="3888"/>
             <w:shd w:val="clear" w:fill="1f3d6b"/>
           </w:tcPr>
           <w:p>
@@ -2872,7 +3216,7 @@
                 <w:color w:val="FFFFFF"/>
                 <w:sz w:val="17"/>
               </w:rPr>
-              <w:t>Insight</w:t>
+              <w:t>Why it cannot be calculated</w:t>
             </w:r>
           </w:p>
         </w:tc>
@@ -2880,7 +3224,7 @@
       <w:tr>
         <w:tc>
           <w:tcPr>
-            <w:tcW w:type="dxa" w:w="2304"/>
+            <w:tcW w:type="dxa" w:w="3024"/>
           </w:tcPr>
           <w:p>
             <w:r/>
@@ -2888,13 +3232,13 @@
               <w:rPr>
                 <w:sz w:val="17"/>
               </w:rPr>
-              <w:t>LTIFR / TRIFR</w:t>
+              <w:t>Realised US$ per carat</w:t>
             </w:r>
           </w:p>
         </w:tc>
         <w:tc>
           <w:tcPr>
-            <w:tcW w:type="dxa" w:w="2448"/>
+            <w:tcW w:type="dxa" w:w="3168"/>
           </w:tcPr>
           <w:p>
             <w:r/>
@@ -2902,13 +3246,13 @@
               <w:rPr>
                 <w:sz w:val="17"/>
               </w:rPr>
-              <w:t>Not disclosed</w:t>
+              <w:t>Revenue ÷ carats sold</w:t>
             </w:r>
           </w:p>
         </w:tc>
         <w:tc>
           <w:tcPr>
-            <w:tcW w:type="dxa" w:w="5616"/>
+            <w:tcW w:type="dxa" w:w="3888"/>
           </w:tcPr>
           <w:p>
             <w:r/>
@@ -2916,86 +3260,7 @@
               <w:rPr>
                 <w:sz w:val="17"/>
               </w:rPr>
-              <w:t>This is a non-negotiable mining KPI that is entirely absent from the pre-release and the incentive scheme</w:t>
-            </w:r>
-          </w:p>
-        </w:tc>
-      </w:tr>
-    </w:tbl>
-    <w:p>
-      <w:pPr>
-        <w:spacing w:before="100" w:after="20"/>
-      </w:pPr>
-      <w:r>
-        <w:rPr>
-          <w:b/>
-          <w:color w:val="1F3D6B"/>
-          <w:sz w:val="22"/>
-        </w:rPr>
-        <w:t>2.8 ESG / sustainability</w:t>
-      </w:r>
-    </w:p>
-    <w:tbl>
-      <w:tblPr>
-        <w:tblStyle w:val="TableGrid"/>
-        <w:tblW w:type="auto" w:w="0"/>
-        <w:jc w:val="center"/>
-        <w:tblLook w:firstColumn="1" w:firstRow="1" w:lastColumn="0" w:lastRow="0" w:noHBand="0" w:noVBand="1" w:val="04A0"/>
-      </w:tblPr>
-      <w:tblGrid>
-        <w:gridCol w:w="3552"/>
-        <w:gridCol w:w="3552"/>
-        <w:gridCol w:w="3552"/>
-      </w:tblGrid>
-      <w:tr>
-        <w:tc>
-          <w:tcPr>
-            <w:tcW w:type="dxa" w:w="2880"/>
-            <w:shd w:val="clear" w:fill="1f3d6b"/>
-          </w:tcPr>
-          <w:p>
-            <w:r/>
-            <w:r>
-              <w:rPr>
-                <w:b/>
-                <w:color w:val="FFFFFF"/>
-                <w:sz w:val="17"/>
-              </w:rPr>
-              <w:t>KPI</w:t>
-            </w:r>
-          </w:p>
-        </w:tc>
-        <w:tc>
-          <w:tcPr>
-            <w:tcW w:type="dxa" w:w="3312"/>
-            <w:shd w:val="clear" w:fill="1f3d6b"/>
-          </w:tcPr>
-          <w:p>
-            <w:r/>
-            <w:r>
-              <w:rPr>
-                <w:b/>
-                <w:color w:val="FFFFFF"/>
-                <w:sz w:val="17"/>
-              </w:rPr>
-              <w:t>Diamante</w:t>
-            </w:r>
-          </w:p>
-        </w:tc>
-        <w:tc>
-          <w:tcPr>
-            <w:tcW w:type="dxa" w:w="4320"/>
-            <w:shd w:val="clear" w:fill="1f3d6b"/>
-          </w:tcPr>
-          <w:p>
-            <w:r/>
-            <w:r>
-              <w:rPr>
-                <w:b/>
-                <w:color w:val="FFFFFF"/>
-                <w:sz w:val="17"/>
-              </w:rPr>
-              <w:t>Insight</w:t>
+              <w:t>Carats sold are not disclosed</w:t>
             </w:r>
           </w:p>
         </w:tc>
@@ -3003,7 +3268,7 @@
       <w:tr>
         <w:tc>
           <w:tcPr>
-            <w:tcW w:type="dxa" w:w="2880"/>
+            <w:tcW w:type="dxa" w:w="3024"/>
           </w:tcPr>
           <w:p>
             <w:r/>
@@ -3011,13 +3276,13 @@
               <w:rPr>
                 <w:sz w:val="17"/>
               </w:rPr>
-              <w:t>Scope 1 and 2 emissions vs roadmap</w:t>
+              <w:t>Carats recovered / grade / recovery</w:t>
             </w:r>
           </w:p>
         </w:tc>
         <w:tc>
           <w:tcPr>
-            <w:tcW w:type="dxa" w:w="3312"/>
+            <w:tcW w:type="dxa" w:w="3168"/>
           </w:tcPr>
           <w:p>
             <w:r/>
@@ -3025,13 +3290,13 @@
               <w:rPr>
                 <w:sz w:val="17"/>
               </w:rPr>
-              <w:t>Roadmap targets a 35–40% cut by 2030; actual intensity not disclosed</w:t>
+              <w:t>Various operating ratios</w:t>
             </w:r>
           </w:p>
         </w:tc>
         <w:tc>
           <w:tcPr>
-            <w:tcW w:type="dxa" w:w="4320"/>
+            <w:tcW w:type="dxa" w:w="3888"/>
           </w:tcPr>
           <w:p>
             <w:r/>
@@ -3039,7 +3304,7 @@
               <w:rPr>
                 <w:sz w:val="17"/>
               </w:rPr>
-              <w:t>The company has a target but does not yet report actual emissions performance against it</w:t>
+              <w:t>No production or tonnage data is given</w:t>
             </w:r>
           </w:p>
         </w:tc>
@@ -3047,7 +3312,7 @@
       <w:tr>
         <w:tc>
           <w:tcPr>
-            <w:tcW w:type="dxa" w:w="2880"/>
+            <w:tcW w:type="dxa" w:w="3024"/>
           </w:tcPr>
           <w:p>
             <w:r/>
@@ -3055,13 +3320,13 @@
               <w:rPr>
                 <w:sz w:val="17"/>
               </w:rPr>
-              <w:t>Rehabilitation / tailings</w:t>
+              <w:t>Free cash flow</w:t>
             </w:r>
           </w:p>
         </w:tc>
         <w:tc>
           <w:tcPr>
-            <w:tcW w:type="dxa" w:w="3312"/>
+            <w:tcW w:type="dxa" w:w="3168"/>
           </w:tcPr>
           <w:p>
             <w:r/>
@@ -3069,13 +3334,13 @@
               <w:rPr>
                 <w:sz w:val="17"/>
               </w:rPr>
-              <w:t>Provisions R621m (2026) vs R900m (2025)</w:t>
+              <w:t>Operating cash flow − sustaining capex</w:t>
             </w:r>
           </w:p>
         </w:tc>
         <w:tc>
           <w:tcPr>
-            <w:tcW w:type="dxa" w:w="4320"/>
+            <w:tcW w:type="dxa" w:w="3888"/>
           </w:tcPr>
           <w:p>
             <w:r/>
@@ -3083,7 +3348,7 @@
               <w:rPr>
                 <w:sz w:val="17"/>
               </w:rPr>
-              <w:t>Provisions fell R279m, partly from the Botswana disposal; the basis should be checked</w:t>
+              <w:t>No cash flow statement; adjusted EBITDA of R207m is the best proxy</w:t>
             </w:r>
           </w:p>
         </w:tc>
@@ -3091,174 +3356,7 @@
       <w:tr>
         <w:tc>
           <w:tcPr>
-            <w:tcW w:type="dxa" w:w="2880"/>
-          </w:tcPr>
-          <w:p>
-            <w:r/>
-            <w:r>
-              <w:rPr>
-                <w:sz w:val="17"/>
-              </w:rPr>
-              <w:t>Carbon / water per carat</w:t>
-            </w:r>
-          </w:p>
-        </w:tc>
-        <w:tc>
-          <w:tcPr>
-            <w:tcW w:type="dxa" w:w="3312"/>
-          </w:tcPr>
-          <w:p>
-            <w:r/>
-            <w:r>
-              <w:rPr>
-                <w:sz w:val="17"/>
-              </w:rPr>
-              <w:t>Not disclosed</w:t>
-            </w:r>
-          </w:p>
-        </w:tc>
-        <w:tc>
-          <w:tcPr>
-            <w:tcW w:type="dxa" w:w="4320"/>
-          </w:tcPr>
-          <w:p>
-            <w:r/>
-            <w:r>
-              <w:rPr>
-                <w:sz w:val="17"/>
-              </w:rPr>
-              <w:t>Intensity metrics that peers report are absent</w:t>
-            </w:r>
-          </w:p>
-        </w:tc>
-      </w:tr>
-    </w:tbl>
-    <w:p>
-      <w:pPr>
-        <w:spacing w:before="100" w:after="20"/>
-      </w:pPr>
-      <w:r>
-        <w:rPr>
-          <w:b/>
-          <w:color w:val="1F3D6B"/>
-          <w:sz w:val="22"/>
-        </w:rPr>
-        <w:t>2.9 Reserves, market and shareholder returns</w:t>
-      </w:r>
-    </w:p>
-    <w:tbl>
-      <w:tblPr>
-        <w:tblStyle w:val="TableGrid"/>
-        <w:tblW w:type="auto" w:w="0"/>
-        <w:jc w:val="center"/>
-        <w:tblLook w:firstColumn="1" w:firstRow="1" w:lastColumn="0" w:lastRow="0" w:noHBand="0" w:noVBand="1" w:val="04A0"/>
-      </w:tblPr>
-      <w:tblGrid>
-        <w:gridCol w:w="3552"/>
-        <w:gridCol w:w="3552"/>
-        <w:gridCol w:w="3552"/>
-      </w:tblGrid>
-      <w:tr>
-        <w:tc>
-          <w:tcPr>
-            <w:tcW w:type="dxa" w:w="2592"/>
-            <w:shd w:val="clear" w:fill="1f3d6b"/>
-          </w:tcPr>
-          <w:p>
-            <w:r/>
-            <w:r>
-              <w:rPr>
-                <w:b/>
-                <w:color w:val="FFFFFF"/>
-                <w:sz w:val="17"/>
-              </w:rPr>
-              <w:t>KPI</w:t>
-            </w:r>
-          </w:p>
-        </w:tc>
-        <w:tc>
-          <w:tcPr>
-            <w:tcW w:type="dxa" w:w="3600"/>
-            <w:shd w:val="clear" w:fill="1f3d6b"/>
-          </w:tcPr>
-          <w:p>
-            <w:r/>
-            <w:r>
-              <w:rPr>
-                <w:b/>
-                <w:color w:val="FFFFFF"/>
-                <w:sz w:val="17"/>
-              </w:rPr>
-              <w:t>Diamante</w:t>
-            </w:r>
-          </w:p>
-        </w:tc>
-        <w:tc>
-          <w:tcPr>
-            <w:tcW w:type="dxa" w:w="4320"/>
-            <w:shd w:val="clear" w:fill="1f3d6b"/>
-          </w:tcPr>
-          <w:p>
-            <w:r/>
-            <w:r>
-              <w:rPr>
-                <w:b/>
-                <w:color w:val="FFFFFF"/>
-                <w:sz w:val="17"/>
-              </w:rPr>
-              <w:t>Insight</w:t>
-            </w:r>
-          </w:p>
-        </w:tc>
-      </w:tr>
-      <w:tr>
-        <w:tc>
-          <w:tcPr>
-            <w:tcW w:type="dxa" w:w="2592"/>
-          </w:tcPr>
-          <w:p>
-            <w:r/>
-            <w:r>
-              <w:rPr>
-                <w:sz w:val="17"/>
-              </w:rPr>
-              <w:t>Reserves / life-of-mine</w:t>
-            </w:r>
-          </w:p>
-        </w:tc>
-        <w:tc>
-          <w:tcPr>
-            <w:tcW w:type="dxa" w:w="3600"/>
-          </w:tcPr>
-          <w:p>
-            <w:r/>
-            <w:r>
-              <w:rPr>
-                <w:sz w:val="17"/>
-              </w:rPr>
-              <w:t>Not disclosed (but "life of mines" is a board focus)</w:t>
-            </w:r>
-          </w:p>
-        </w:tc>
-        <w:tc>
-          <w:tcPr>
-            <w:tcW w:type="dxa" w:w="4320"/>
-          </w:tcPr>
-          <w:p>
-            <w:r/>
-            <w:r>
-              <w:rPr>
-                <w:sz w:val="17"/>
-              </w:rPr>
-              <w:t>A reserve and life-of-mine KPI would reward sustaining the resource</w:t>
-            </w:r>
-          </w:p>
-        </w:tc>
-      </w:tr>
-      <w:tr>
-        <w:tc>
-          <w:tcPr>
-            <w:tcW w:type="dxa" w:w="2592"/>
+            <w:tcW w:type="dxa" w:w="3024"/>
           </w:tcPr>
           <w:p>
             <w:r/>
@@ -3272,7 +3370,7 @@
         </w:tc>
         <w:tc>
           <w:tcPr>
-            <w:tcW w:type="dxa" w:w="3600"/>
+            <w:tcW w:type="dxa" w:w="3168"/>
           </w:tcPr>
           <w:p>
             <w:r/>
@@ -3280,13 +3378,13 @@
               <w:rPr>
                 <w:sz w:val="17"/>
               </w:rPr>
-              <w:t>Cannot compute (share count not given)</w:t>
+              <w:t>Loss ÷ weighted-average shares</w:t>
             </w:r>
           </w:p>
         </w:tc>
         <w:tc>
           <w:tcPr>
-            <w:tcW w:type="dxa" w:w="4320"/>
+            <w:tcW w:type="dxa" w:w="3888"/>
           </w:tcPr>
           <w:p>
             <w:r/>
@@ -3294,7 +3392,7 @@
               <w:rPr>
                 <w:sz w:val="17"/>
               </w:rPr>
-              <w:t>Needed for a listed company; would be deeply negative</w:t>
+              <w:t>The number of shares is not disclosed</w:t>
             </w:r>
           </w:p>
         </w:tc>
@@ -3302,7 +3400,51 @@
       <w:tr>
         <w:tc>
           <w:tcPr>
-            <w:tcW w:type="dxa" w:w="2592"/>
+            <w:tcW w:type="dxa" w:w="3024"/>
+          </w:tcPr>
+          <w:p>
+            <w:r/>
+            <w:r>
+              <w:rPr>
+                <w:sz w:val="17"/>
+              </w:rPr>
+              <w:t>Safety (LTIFR / TRIFR)</w:t>
+            </w:r>
+          </w:p>
+        </w:tc>
+        <w:tc>
+          <w:tcPr>
+            <w:tcW w:type="dxa" w:w="3168"/>
+          </w:tcPr>
+          <w:p>
+            <w:r/>
+            <w:r>
+              <w:rPr>
+                <w:sz w:val="17"/>
+              </w:rPr>
+              <w:t>Injuries × 1 000 000 ÷ hours worked</w:t>
+            </w:r>
+          </w:p>
+        </w:tc>
+        <w:tc>
+          <w:tcPr>
+            <w:tcW w:type="dxa" w:w="3888"/>
+          </w:tcPr>
+          <w:p>
+            <w:r/>
+            <w:r>
+              <w:rPr>
+                <w:sz w:val="17"/>
+              </w:rPr>
+              <w:t>No safety data is disclosed</w:t>
+            </w:r>
+          </w:p>
+        </w:tc>
+      </w:tr>
+      <w:tr>
+        <w:tc>
+          <w:tcPr>
+            <w:tcW w:type="dxa" w:w="3024"/>
           </w:tcPr>
           <w:p>
             <w:r/>
@@ -3316,7 +3458,7 @@
         </w:tc>
         <w:tc>
           <w:tcPr>
-            <w:tcW w:type="dxa" w:w="3600"/>
+            <w:tcW w:type="dxa" w:w="3168"/>
           </w:tcPr>
           <w:p>
             <w:r/>
@@ -3324,13 +3466,13 @@
               <w:rPr>
                 <w:sz w:val="17"/>
               </w:rPr>
-              <w:t>Not disclosed</w:t>
+              <w:t>(Share price change + dividends) ÷ opening price</w:t>
             </w:r>
           </w:p>
         </w:tc>
         <w:tc>
           <w:tcPr>
-            <w:tcW w:type="dxa" w:w="4320"/>
+            <w:tcW w:type="dxa" w:w="3888"/>
           </w:tcPr>
           <w:p>
             <w:r/>
@@ -3338,56 +3480,50 @@
               <w:rPr>
                 <w:sz w:val="17"/>
               </w:rPr>
-              <w:t>The standard long-term-incentive measure, which the scheme does not use</w:t>
-            </w:r>
-          </w:p>
-        </w:tc>
-      </w:tr>
-      <w:tr>
-        <w:tc>
-          <w:tcPr>
-            <w:tcW w:type="dxa" w:w="2592"/>
-          </w:tcPr>
-          <w:p>
-            <w:r/>
-            <w:r>
-              <w:rPr>
-                <w:sz w:val="17"/>
-              </w:rPr>
-              <w:t>Dividends</w:t>
-            </w:r>
-          </w:p>
-        </w:tc>
-        <w:tc>
-          <w:tcPr>
-            <w:tcW w:type="dxa" w:w="3600"/>
-          </w:tcPr>
-          <w:p>
-            <w:r/>
-            <w:r>
-              <w:rPr>
-                <w:sz w:val="17"/>
-              </w:rPr>
-              <w:t>None for two years</w:t>
-            </w:r>
-          </w:p>
-        </w:tc>
-        <w:tc>
-          <w:tcPr>
-            <w:tcW w:type="dxa" w:w="4320"/>
-          </w:tcPr>
-          <w:p>
-            <w:r/>
-            <w:r>
-              <w:rPr>
-                <w:sz w:val="17"/>
-              </w:rPr>
-              <w:t>No cash returns while the company is loss-making and refinancing</w:t>
+              <w:t>No share price is disclosed</w:t>
             </w:r>
           </w:p>
         </w:tc>
       </w:tr>
     </w:tbl>
+    <w:p>
+      <w:pPr>
+        <w:spacing w:before="40" w:after="20"/>
+      </w:pPr>
+      <w:r>
+        <w:rPr>
+          <w:b/>
+          <w:i/>
+          <w:color w:val="555555"/>
+          <w:sz w:val="18"/>
+        </w:rPr>
+        <w:t>Analysis</w:t>
+      </w:r>
+    </w:p>
+    <w:p>
+      <w:pPr>
+        <w:pStyle w:val="ListBullet"/>
+        <w:spacing w:after="60"/>
+      </w:pPr>
+      <w:r>
+        <w:rPr>
+          <w:sz w:val="20"/>
+        </w:rPr>
+        <w:t>Diamante does not disclose the production, per-carat, safety or share-based data that every listed diamond miner reports.</w:t>
+      </w:r>
+    </w:p>
+    <w:p>
+      <w:pPr>
+        <w:pStyle w:val="ListBullet"/>
+        <w:spacing w:after="60"/>
+      </w:pPr>
+      <w:r>
+        <w:rPr>
+          <w:sz w:val="20"/>
+        </w:rPr>
+        <w:t>This means the most important value, cost, safety and shareholder KPIs cannot even be measured, which is itself a significant finding.</w:t>
+      </w:r>
+    </w:p>
     <w:p>
       <w:pPr>
         <w:spacing w:before="180" w:after="40"/>
@@ -3401,7 +3537,7 @@
           <w:color w:val="1F3D6B"/>
           <w:sz w:val="26"/>
         </w:rPr>
-        <w:t>3. The standard diamond-industry KPIs that Diamante is missing (qualitative analysis)</w:t>
+        <w:t>3. The standard diamond-industry KPIs Diamante is missing (qualitative analysis)</w:t>
       </w:r>
     </w:p>
     <w:p>
@@ -3414,12 +3550,12 @@
           <w:i/>
           <w:sz w:val="19"/>
         </w:rPr>
-        <w:t>The following measures are standard across the diamond industry, yet are absent from both Diamante’s disclosure and its incentive scheme. Their omission is significant.</w:t>
+        <w:t>The following measures are standard across the diamond industry, yet are absent from both Diamante’s disclosure and its incentive scheme, and their omission is significant.</w:t>
       </w:r>
     </w:p>
     <w:p>
       <w:pPr>
-        <w:spacing w:before="100" w:after="20"/>
+        <w:spacing w:before="120" w:after="20"/>
       </w:pPr>
       <w:r>
         <w:rPr>
@@ -3439,7 +3575,7 @@
         <w:rPr>
           <w:sz w:val="20"/>
         </w:rPr>
-        <w:t>This is the single most important value metric in the diamond industry, because it shows how much value is being extracted from each stone sold.</w:t>
+        <w:t>This is the single most important value metric in the diamond industry, because it shows how much value is extracted from each stone sold.</w:t>
       </w:r>
     </w:p>
     <w:p>
@@ -3451,7 +3587,7 @@
         <w:rPr>
           <w:sz w:val="20"/>
         </w:rPr>
-        <w:t>It captures Diamante’s value-led strategy far better than the vague "high-value diamonds as a percentage" measure that the scheme uses.</w:t>
+        <w:t>It captures Diamante’s value-led strategy far better than the vague high-value-percentage measure the scheme uses.</w:t>
       </w:r>
     </w:p>
     <w:p>
@@ -3463,12 +3599,12 @@
         <w:rPr>
           <w:sz w:val="20"/>
         </w:rPr>
-        <w:t>Without it, Diamante cannot demonstrate whether it is actually realising higher value, and management is not rewarded for the tender-timing decisions, such as deferring sales in weak markets, that protect price.</w:t>
+        <w:t>Without it, Diamante cannot show whether it is really realising higher value, and management is not rewarded for the tender-timing decisions that protect price.</w:t>
       </w:r>
     </w:p>
     <w:p>
       <w:pPr>
-        <w:spacing w:before="100" w:after="20"/>
+        <w:spacing w:before="120" w:after="20"/>
       </w:pPr>
       <w:r>
         <w:rPr>
@@ -3500,7 +3636,7 @@
         <w:rPr>
           <w:sz w:val="20"/>
         </w:rPr>
-        <w:t>Diamante instead rewards absolute cost growth staying below inflation, which can be achieved by mining less rather than mining more efficiently.</w:t>
+        <w:t>Diamante instead rewards absolute cost growth below inflation, which can be met by mining less rather than mining better.</w:t>
       </w:r>
     </w:p>
     <w:p>
@@ -3512,12 +3648,12 @@
         <w:rPr>
           <w:sz w:val="20"/>
         </w:rPr>
-        <w:t>This matters especially now, because Mine 2’s volumes are collapsing, so an absolute cost measure flatters performance while unit costs may be rising.</w:t>
+        <w:t>This matters now, because Mine 2’s volumes are collapsing, so an absolute cost measure flatters performance while unit costs may be rising.</w:t>
       </w:r>
     </w:p>
     <w:p>
       <w:pPr>
-        <w:spacing w:before="100" w:after="20"/>
+        <w:spacing w:before="120" w:after="20"/>
       </w:pPr>
       <w:r>
         <w:rPr>
@@ -3549,7 +3685,7 @@
         <w:rPr>
           <w:sz w:val="20"/>
         </w:rPr>
-        <w:t>Diamante discloses no carat or tonnage data at all, which means none of the per-carat value or cost KPIs can even be calculated.</w:t>
+        <w:t>Diamante discloses no carat or tonnage data, so none of the per-carat value or cost KPIs can be calculated.</w:t>
       </w:r>
     </w:p>
     <w:p>
@@ -3561,12 +3697,12 @@
         <w:rPr>
           <w:sz w:val="20"/>
         </w:rPr>
-        <w:t>For a listed company this is a real disclosure gap that the auditors and analysts would question.</w:t>
+        <w:t>For a listed company this is a real disclosure gap that auditors and analysts would question.</w:t>
       </w:r>
     </w:p>
     <w:p>
       <w:pPr>
-        <w:spacing w:before="100" w:after="20"/>
+        <w:spacing w:before="120" w:after="20"/>
       </w:pPr>
       <w:r>
         <w:rPr>
@@ -3598,7 +3734,7 @@
         <w:rPr>
           <w:sz w:val="20"/>
         </w:rPr>
-        <w:t>The company’s continued existence depends on generating cash and completing a refinancing, yet neither cash flow nor net-debt reduction is measured or rewarded.</w:t>
+        <w:t>The company’s survival depends on generating cash and completing a refinancing, yet neither is measured or rewarded.</w:t>
       </w:r>
     </w:p>
     <w:p>
@@ -3610,12 +3746,12 @@
         <w:rPr>
           <w:sz w:val="20"/>
         </w:rPr>
-        <w:t>Rewarding management for deleveraging would align their incentives directly with the company’s survival and with the interests of the shareholders being asked for a rights issue.</w:t>
+        <w:t>Rewarding deleveraging would align management directly with survival and with the shareholders being asked for a rights issue.</w:t>
       </w:r>
     </w:p>
     <w:p>
       <w:pPr>
-        <w:spacing w:before="100" w:after="20"/>
+        <w:spacing w:before="120" w:after="20"/>
       </w:pPr>
       <w:r>
         <w:rPr>
@@ -3647,12 +3783,12 @@
         <w:rPr>
           <w:sz w:val="20"/>
         </w:rPr>
-        <w:t>Its absence is dangerous here, because the cost KPI could actively reward cutting the very safety and maintenance spending that a deep-level mine depends on.</w:t>
+        <w:t>Its absence is dangerous here, because the cost KPI could reward cutting the safety and maintenance spending a deep-level mine depends on.</w:t>
       </w:r>
     </w:p>
     <w:p>
       <w:pPr>
-        <w:spacing w:before="100" w:after="20"/>
+        <w:spacing w:before="120" w:after="20"/>
       </w:pPr>
       <w:r>
         <w:rPr>
@@ -3672,7 +3808,7 @@
         <w:rPr>
           <w:sz w:val="20"/>
         </w:rPr>
-        <w:t>Peers report actual outcomes such as carbon and water intensity per carat, tailings compliance and rehabilitation progress, measured against their own targets.</w:t>
+        <w:t>Peers report actual outcomes such as carbon and water intensity per carat, tailings compliance and rehabilitation progress.</w:t>
       </w:r>
     </w:p>
     <w:p>
@@ -3684,12 +3820,12 @@
         <w:rPr>
           <w:sz w:val="20"/>
         </w:rPr>
-        <w:t>Diamante has a 35–40% Scope 1 and 2 reduction roadmap but rewards an external reporting award instead of the real outcomes, which is a greenwashing risk and is misaligned with its own strategy.</w:t>
+        <w:t>Diamante has a 35–40% Scope 1 and 2 reduction roadmap but rewards an external reporting award instead of the real outcomes, which is a greenwashing risk.</w:t>
       </w:r>
     </w:p>
     <w:p>
       <w:pPr>
-        <w:spacing w:before="100" w:after="20"/>
+        <w:spacing w:before="120" w:after="20"/>
       </w:pPr>
       <w:r>
         <w:rPr>
@@ -3721,7 +3857,7 @@
         <w:rPr>
           <w:sz w:val="20"/>
         </w:rPr>
-        <w:t>This is directly relevant to Diamante, because the board has identified the "life of mines" and which capital projects to prioritise as a key focus.</w:t>
+        <w:t>This is directly relevant, because the board has identified the life of mines and capital-project prioritisation as a key focus.</w:t>
       </w:r>
     </w:p>
     <w:p>
@@ -3738,7 +3874,7 @@
     </w:p>
     <w:p>
       <w:pPr>
-        <w:spacing w:before="100" w:after="20"/>
+        <w:spacing w:before="120" w:after="20"/>
       </w:pPr>
       <w:r>
         <w:rPr>
@@ -3758,7 +3894,7 @@
         <w:rPr>
           <w:sz w:val="20"/>
         </w:rPr>
-        <w:t>Relative Total Shareholder Return is the standard long-term-incentive measure for listed miners, because it aligns pay with the actual return delivered to shareholders over time.</w:t>
+        <w:t>Relative Total Shareholder Return is the standard long-term-incentive measure for listed miners, because it aligns pay with the actual return to shareholders.</w:t>
       </w:r>
     </w:p>
     <w:p>
@@ -3770,7 +3906,7 @@
         <w:rPr>
           <w:sz w:val="20"/>
         </w:rPr>
-        <w:t>Measuring it relative to peers, such as Petra and Gem Diamonds, strips out the diamond price cycle that management cannot control.</w:t>
+        <w:t>Measured relative to peers such as Petra and Gem Diamonds, it strips out the diamond price cycle that management cannot control.</w:t>
       </w:r>
     </w:p>
     <w:p>
@@ -3810,7 +3946,7 @@
         <w:rPr>
           <w:sz w:val="20"/>
         </w:rPr>
-        <w:t>Taken together, the calculations show a loss-making, highly geared business whose survival depends on cash and refinancing, so the measures that matter most are cash, net debt, unit cost, realised value, safety and real ESG outcomes.</w:t>
+        <w:t>The calculations show a loss-making, highly geared business whose survival depends on cash and refinancing, so the measures that matter most are cash, net debt, unit cost, realised value, safety and real ESG outcomes.</w:t>
       </w:r>
     </w:p>
     <w:p>
@@ -3822,7 +3958,7 @@
         <w:rPr>
           <w:sz w:val="20"/>
         </w:rPr>
-        <w:t>These are precisely the industry-standard KPIs that Diamante does not use, while the KPIs it does use are largely uncontrollable, unachievable or gameable.</w:t>
+        <w:t>These are precisely the industry-standard KPIs Diamante does not use, while the KPIs it does use are largely uncontrollable, unachievable or gameable.</w:t>
       </w:r>
     </w:p>
     <w:p>
@@ -3834,7 +3970,7 @@
         <w:rPr>
           <w:sz w:val="20"/>
         </w:rPr>
-        <w:t>The incentive scheme should therefore be rebuilt on this industry-standard set, tiered by responsibility, measured per mine where possible, and market-adjusted against peers, with the detailed redesign set out in the companion Document 5 evaluation.</w:t>
+        <w:t>The incentive scheme should be rebuilt on this industry-standard set, tiered by responsibility, measured per mine where possible, and market-adjusted against peers.</w:t>
       </w:r>
     </w:p>
     <w:p>
@@ -3846,7 +3982,7 @@
         <w:rPr>
           <w:sz w:val="20"/>
         </w:rPr>
-        <w:t>Diamante should also begin disclosing the operating, safety and ESG-intensity metrics that its listed peers report, because without that data neither management nor investors can measure the performance that truly drives value.</w:t>
+        <w:t>Diamante should also start disclosing the operating, safety and ESG-intensity metrics its listed peers report, because without that data neither management nor investors can measure the performance that truly drives value.</w:t>
       </w:r>
     </w:p>
     <w:p>

</xml_diff>